<commit_message>
content: Research Project (Cox's Bazar) facilitator resources + offline pack
Add three facilitator-facing resource materials for the Research Project
(Cox's Bazar) component and fold them into the offline pack generator:

- cb-rp-running-this-offline — "Before you start" offline setup guidance.
- cb-rp-safeguarding-and-protection — safeguarding/protection for the RP.
- cb-rp-assessing-the-research — how to assess the FSI1 anchor competency.

generate-rp.js now embeds these in the facilitator unit plan (Before you start,
Safeguarding and protection, Assessing the investigation) and produces two new
printable artefacts: an FSI1 Assessment Record and picture-word cards built from
the source pack's programme word bank. Both are wired as downloads on the unit.

Co-Authored-By: Claude Opus 4.8 <noreply@anthropic.com>
</commit_message>
<xml_diff>
--- a/public/downloads/research-project-facilitator-unit-plan.docx
+++ b/public/downloads/research-project-facilitator-unit-plan.docx
@@ -129,19 +129,40 @@
           <w:sz w:val="26"/>
           <w:szCs w:val="26"/>
         </w:rPr>
-        <w:t xml:space="preserve">Assessing the anchor competency</w:t>
-      </w:r>
-    </w:p>
-    <w:p>
-      <w:pPr>
-        <w:spacing w:after="120" w:before="0"/>
-      </w:pPr>
-      <w:r>
-        <w:rPr>
-          <w:sz w:val="22"/>
-          <w:szCs w:val="22"/>
-        </w:rPr>
-        <w:t xml:space="preserve">On Learning Bridge+, a learner's proficiency in the anchor competency, investigating real-world issues (FSI1), is judged by the educator against Amala's proficiency scale at two points: midway (formative) and at the end (summative). It is not marked from the final output alone. Gather evidence from across the whole investigation: the research question and plan they framed, the interview and survey questions they designed, how they weighed their sources (their evidence log), how they moved from raw findings to insight, and the final research output and how they answer questions about it. A learner who gathered evidence but could not turn it into an insight, and one who reached a defensible insight, are showing different proficiency, even with a similar-looking poster. Do not over-assess: two considered judgements, built from evidence gathered over time, are worth more than repeated testing. This is one of the two certificated competencies for the readiness decision.</w:t>
+        <w:t xml:space="preserve">How to use this plan</w:t>
+      </w:r>
+    </w:p>
+    <w:p>
+      <w:pPr>
+        <w:spacing w:after="120" w:before="0"/>
+      </w:pPr>
+      <w:r>
+        <w:rPr>
+          <w:sz w:val="22"/>
+          <w:szCs w:val="22"/>
+        </w:rPr>
+        <w:t xml:space="preserve">This plan is set out in hours, not weeks. Work through the phases in order; within a phase, the blocks build on each other. Each block carries its full guidance inline. Read "Before you start" and "Safeguarding and protection" first; the source pack the learners read is in Appendix A, the full original articles in Appendix B, and how to assess FSI1 in "Assessing the investigation". Deliver in the language you share with learners. Times are generous on purpose.</w:t>
+      </w:r>
+    </w:p>
+    <w:p>
+      <w:r>
+        <w:br w:type="page"/>
+      </w:r>
+    </w:p>
+    <w:p>
+      <w:pPr>
+        <w:pStyle w:val="Heading1"/>
+        <w:spacing w:after="100" w:before="240"/>
+      </w:pPr>
+      <w:r>
+        <w:rPr>
+          <w:b/>
+          <w:bCs/>
+          <w:color w:val="1F3A5F"/>
+          <w:sz w:val="30"/>
+          <w:szCs w:val="30"/>
+        </w:rPr>
+        <w:t xml:space="preserve">Before you start</w:t>
       </w:r>
     </w:p>
     <w:p>
@@ -157,19 +178,1235 @@
           <w:sz w:val="26"/>
           <w:szCs w:val="26"/>
         </w:rPr>
-        <w:t xml:space="preserve">How to use this plan</w:t>
-      </w:r>
-    </w:p>
-    <w:p>
-      <w:pPr>
-        <w:spacing w:after="120" w:before="0"/>
-      </w:pPr>
-      <w:r>
-        <w:rPr>
-          <w:sz w:val="22"/>
-          <w:szCs w:val="22"/>
-        </w:rPr>
-        <w:t xml:space="preserve">This plan is set out in hours, not weeks. Work through the phases in order; within a phase, the blocks build on each other. Each block carries its full guidance inline. The secondary source pack the learners read is reproduced in Appendix A, and the full original articles behind it (facilitator reference) in Appendix B. Deliver in the language you share with learners. Times are generous on purpose.</w:t>
+        <w:t xml:space="preserve">Start here</w:t>
+      </w:r>
+    </w:p>
+    <w:p>
+      <w:pPr>
+        <w:spacing w:after="120" w:before="0"/>
+      </w:pPr>
+      <w:r>
+        <w:rPr>
+          <w:sz w:val="22"/>
+          <w:szCs w:val="22"/>
+        </w:rPr>
+        <w:t xml:space="preserve">This is the first thing to read before you run the Research Project. It is a 50-hour component (30 hours in-person, 20 hours independent) that a whole group works through together over at least 10 weeks, investigating one shared, local challenge: what is happening to the trees on the hills where they live. Everything runs fully offline. You do not need the internet, and you do not need a screen.</w:t>
+      </w:r>
+    </w:p>
+    <w:p>
+      <w:pPr>
+        <w:spacing w:after="120" w:before="0"/>
+      </w:pPr>
+      <w:r>
+        <w:rPr>
+          <w:sz w:val="22"/>
+          <w:szCs w:val="22"/>
+        </w:rPr>
+        <w:t xml:space="preserve">The heart of the course is a real cycle of investigation, handed over to learners bit by bit: early on you lead, in the middle it is shared, and by the end the learners lead. Your job is to make that handover happen safely and warmly, not to deliver facts.</w:t>
+      </w:r>
+    </w:p>
+    <w:p>
+      <w:pPr>
+        <w:pStyle w:val="Heading2"/>
+        <w:spacing w:after="80" w:before="200"/>
+      </w:pPr>
+      <w:r>
+        <w:rPr>
+          <w:b/>
+          <w:bCs/>
+          <w:color w:val="7A3B69"/>
+          <w:sz w:val="26"/>
+          <w:szCs w:val="26"/>
+        </w:rPr>
+        <w:t xml:space="preserve">The offline pack</w:t>
+      </w:r>
+    </w:p>
+    <w:p>
+      <w:pPr>
+        <w:spacing w:after="120" w:before="0"/>
+      </w:pPr>
+      <w:r>
+        <w:rPr>
+          <w:sz w:val="22"/>
+          <w:szCs w:val="22"/>
+        </w:rPr>
+        <w:t xml:space="preserve">You have four things, all editable and printable:</w:t>
+      </w:r>
+    </w:p>
+    <w:p>
+      <w:pPr>
+        <w:pStyle w:val="ListParagraph"/>
+        <w:numPr>
+          <w:ilvl w:val="0"/>
+          <w:numId w:val="1"/>
+        </w:numPr>
+        <w:spacing w:after="60"/>
+      </w:pPr>
+      <w:r>
+        <w:rPr>
+          <w:sz w:val="22"/>
+          <w:szCs w:val="22"/>
+        </w:rPr>
+        <w:t xml:space="preserve">The Facilitator Unit Plan and Guide (this pack) — the full plan with every session's guidance, the</w:t>
+      </w:r>
+    </w:p>
+    <w:p>
+      <w:pPr>
+        <w:spacing w:after="120" w:before="0"/>
+      </w:pPr>
+      <w:r>
+        <w:rPr>
+          <w:sz w:val="22"/>
+          <w:szCs w:val="22"/>
+        </w:rPr>
+        <w:t xml:space="preserve">source pack, and the original articles behind it.</w:t>
+      </w:r>
+    </w:p>
+    <w:p>
+      <w:pPr>
+        <w:pStyle w:val="ListParagraph"/>
+        <w:numPr>
+          <w:ilvl w:val="0"/>
+          <w:numId w:val="1"/>
+        </w:numPr>
+        <w:spacing w:after="60"/>
+      </w:pPr>
+      <w:r>
+        <w:rPr>
+          <w:sz w:val="22"/>
+          <w:szCs w:val="22"/>
+        </w:rPr>
+        <w:t xml:space="preserve">The Student Workbook — the research book each learner keeps: the sources to read, the research word</w:t>
+      </w:r>
+    </w:p>
+    <w:p>
+      <w:pPr>
+        <w:spacing w:after="120" w:before="0"/>
+      </w:pPr>
+      <w:r>
+        <w:rPr>
+          <w:sz w:val="22"/>
+          <w:szCs w:val="22"/>
+        </w:rPr>
+        <w:t xml:space="preserve">bank, and a page for each step of the investigation.</w:t>
+      </w:r>
+    </w:p>
+    <w:p>
+      <w:pPr>
+        <w:pStyle w:val="ListParagraph"/>
+        <w:numPr>
+          <w:ilvl w:val="0"/>
+          <w:numId w:val="1"/>
+        </w:numPr>
+        <w:spacing w:after="60"/>
+      </w:pPr>
+      <w:r>
+        <w:rPr>
+          <w:sz w:val="22"/>
+          <w:szCs w:val="22"/>
+        </w:rPr>
+        <w:t xml:space="preserve">The picture-word cards — printable cards for the research words, to build the word wall.</w:t>
+      </w:r>
+    </w:p>
+    <w:p>
+      <w:pPr>
+        <w:pStyle w:val="ListParagraph"/>
+        <w:numPr>
+          <w:ilvl w:val="0"/>
+          <w:numId w:val="1"/>
+        </w:numPr>
+        <w:spacing w:after="60"/>
+      </w:pPr>
+      <w:r>
+        <w:rPr>
+          <w:sz w:val="22"/>
+          <w:szCs w:val="22"/>
+        </w:rPr>
+        <w:t xml:space="preserve">This start-here, the safeguarding and protection guide, and the assessment guide (all in this pack).</w:t>
+      </w:r>
+    </w:p>
+    <w:p>
+      <w:pPr>
+        <w:pStyle w:val="Heading2"/>
+        <w:spacing w:after="80" w:before="200"/>
+      </w:pPr>
+      <w:r>
+        <w:rPr>
+          <w:b/>
+          <w:bCs/>
+          <w:color w:val="7A3B69"/>
+          <w:sz w:val="26"/>
+          <w:szCs w:val="26"/>
+        </w:rPr>
+        <w:t xml:space="preserve">What you need (kit)</w:t>
+      </w:r>
+    </w:p>
+    <w:p>
+      <w:pPr>
+        <w:pStyle w:val="ListParagraph"/>
+        <w:numPr>
+          <w:ilvl w:val="0"/>
+          <w:numId w:val="1"/>
+        </w:numPr>
+        <w:spacing w:after="60"/>
+      </w:pPr>
+      <w:r>
+        <w:rPr>
+          <w:sz w:val="22"/>
+          <w:szCs w:val="22"/>
+        </w:rPr>
+        <w:t xml:space="preserve">One printed research book (student workbook) per learner, and a few spare blank pages.</w:t>
+      </w:r>
+    </w:p>
+    <w:p>
+      <w:pPr>
+        <w:pStyle w:val="ListParagraph"/>
+        <w:numPr>
+          <w:ilvl w:val="0"/>
+          <w:numId w:val="1"/>
+        </w:numPr>
+        <w:spacing w:after="60"/>
+      </w:pPr>
+      <w:r>
+        <w:rPr>
+          <w:sz w:val="22"/>
+          <w:szCs w:val="22"/>
+        </w:rPr>
+        <w:t xml:space="preserve">Pencils, and colours if you have them.</w:t>
+      </w:r>
+    </w:p>
+    <w:p>
+      <w:pPr>
+        <w:pStyle w:val="ListParagraph"/>
+        <w:numPr>
+          <w:ilvl w:val="0"/>
+          <w:numId w:val="1"/>
+        </w:numPr>
+        <w:spacing w:after="60"/>
+      </w:pPr>
+      <w:r>
+        <w:rPr>
+          <w:sz w:val="22"/>
+          <w:szCs w:val="22"/>
+        </w:rPr>
+        <w:t xml:space="preserve">A wall or floor you can use — for the "before and now" picture, the know / find-out wall, the</w:t>
+      </w:r>
+    </w:p>
+    <w:p>
+      <w:pPr>
+        <w:spacing w:after="120" w:before="0"/>
+      </w:pPr>
+      <w:r>
+        <w:rPr>
+          <w:sz w:val="22"/>
+          <w:szCs w:val="22"/>
+        </w:rPr>
+        <w:t xml:space="preserve">community map, the theme sorting, and the trust line. Big paper or a cleared wall space works.</w:t>
+      </w:r>
+    </w:p>
+    <w:p>
+      <w:pPr>
+        <w:pStyle w:val="ListParagraph"/>
+        <w:numPr>
+          <w:ilvl w:val="0"/>
+          <w:numId w:val="1"/>
+        </w:numPr>
+        <w:spacing w:after="60"/>
+      </w:pPr>
+      <w:r>
+        <w:rPr>
+          <w:sz w:val="22"/>
+          <w:szCs w:val="22"/>
+        </w:rPr>
+        <w:t xml:space="preserve">Cards you can move around: for sorting evidence into themes, and for the trust line. Cut paper is fine.</w:t>
+      </w:r>
+    </w:p>
+    <w:p>
+      <w:pPr>
+        <w:pStyle w:val="ListParagraph"/>
+        <w:numPr>
+          <w:ilvl w:val="0"/>
+          <w:numId w:val="1"/>
+        </w:numPr>
+        <w:spacing w:after="60"/>
+      </w:pPr>
+      <w:r>
+        <w:rPr>
+          <w:sz w:val="22"/>
+          <w:szCs w:val="22"/>
+        </w:rPr>
+        <w:t xml:space="preserve">The picture-word cards, cut out, for the word wall.</w:t>
+      </w:r>
+    </w:p>
+    <w:p>
+      <w:pPr>
+        <w:pStyle w:val="ListParagraph"/>
+        <w:numPr>
+          <w:ilvl w:val="0"/>
+          <w:numId w:val="1"/>
+        </w:numPr>
+        <w:spacing w:after="60"/>
+      </w:pPr>
+      <w:r>
+        <w:rPr>
+          <w:sz w:val="22"/>
+          <w:szCs w:val="22"/>
+        </w:rPr>
+        <w:t xml:space="preserve">The pictures you prepare (see below).</w:t>
+      </w:r>
+    </w:p>
+    <w:p>
+      <w:pPr>
+        <w:pStyle w:val="Heading2"/>
+        <w:spacing w:after="80" w:before="200"/>
+      </w:pPr>
+      <w:r>
+        <w:rPr>
+          <w:b/>
+          <w:bCs/>
+          <w:color w:val="7A3B69"/>
+          <w:sz w:val="26"/>
+          <w:szCs w:val="26"/>
+        </w:rPr>
+        <w:t xml:space="preserve">What to prepare, phase by phase</w:t>
+      </w:r>
+    </w:p>
+    <w:p>
+      <w:pPr>
+        <w:pStyle w:val="ListParagraph"/>
+        <w:numPr>
+          <w:ilvl w:val="0"/>
+          <w:numId w:val="1"/>
+        </w:numPr>
+        <w:spacing w:after="60"/>
+      </w:pPr>
+      <w:r>
+        <w:rPr>
+          <w:sz w:val="22"/>
+          <w:szCs w:val="22"/>
+        </w:rPr>
+        <w:t xml:space="preserve">Getting started: a picture — or a story you can tell — of the hills before the camps and now.</w:t>
+      </w:r>
+    </w:p>
+    <w:p>
+      <w:pPr>
+        <w:spacing w:after="120" w:before="0"/>
+      </w:pPr>
+      <w:r>
+        <w:rPr>
+          <w:sz w:val="22"/>
+          <w:szCs w:val="22"/>
+        </w:rPr>
+        <w:t xml:space="preserve">Prepare the research books so learners can make them their own on day one.</w:t>
+      </w:r>
+    </w:p>
+    <w:p>
+      <w:pPr>
+        <w:pStyle w:val="ListParagraph"/>
+        <w:numPr>
+          <w:ilvl w:val="0"/>
+          <w:numId w:val="1"/>
+        </w:numPr>
+        <w:spacing w:after="60"/>
+      </w:pPr>
+      <w:r>
+        <w:rPr>
+          <w:sz w:val="22"/>
+          <w:szCs w:val="22"/>
+        </w:rPr>
+        <w:t xml:space="preserve">Frame the challenge: wall space for the "what we know / what we want to find out" wall and the</w:t>
+      </w:r>
+    </w:p>
+    <w:p>
+      <w:pPr>
+        <w:spacing w:after="120" w:before="0"/>
+      </w:pPr>
+      <w:r>
+        <w:rPr>
+          <w:sz w:val="22"/>
+          <w:szCs w:val="22"/>
+        </w:rPr>
+        <w:t xml:space="preserve">community map. Keep both up all course.</w:t>
+      </w:r>
+    </w:p>
+    <w:p>
+      <w:pPr>
+        <w:pStyle w:val="ListParagraph"/>
+        <w:numPr>
+          <w:ilvl w:val="0"/>
+          <w:numId w:val="1"/>
+        </w:numPr>
+        <w:spacing w:after="60"/>
+      </w:pPr>
+      <w:r>
+        <w:rPr>
+          <w:sz w:val="22"/>
+          <w:szCs w:val="22"/>
+        </w:rPr>
+        <w:t xml:space="preserve">Plan and conduct research: practise the consent words with the group before anyone gathers. Agree,</w:t>
+      </w:r>
+    </w:p>
+    <w:p>
+      <w:pPr>
+        <w:spacing w:after="120" w:before="0"/>
+      </w:pPr>
+      <w:r>
+        <w:rPr>
+          <w:sz w:val="22"/>
+          <w:szCs w:val="22"/>
+        </w:rPr>
+        <w:t xml:space="preserve">with the group and the community, who it is safe and appropriate to speak to — and plan girls' gathering carefully (see the safeguarding guide).</w:t>
+      </w:r>
+    </w:p>
+    <w:p>
+      <w:pPr>
+        <w:pStyle w:val="ListParagraph"/>
+        <w:numPr>
+          <w:ilvl w:val="0"/>
+          <w:numId w:val="1"/>
+        </w:numPr>
+        <w:spacing w:after="60"/>
+      </w:pPr>
+      <w:r>
+        <w:rPr>
+          <w:sz w:val="22"/>
+          <w:szCs w:val="22"/>
+        </w:rPr>
+        <w:t xml:space="preserve">Evaluate evidence: cards for theme-sorting; a line on the floor for the trust line.</w:t>
+      </w:r>
+    </w:p>
+    <w:p>
+      <w:pPr>
+        <w:pStyle w:val="ListParagraph"/>
+        <w:numPr>
+          <w:ilvl w:val="0"/>
+          <w:numId w:val="1"/>
+        </w:numPr>
+        <w:spacing w:after="60"/>
+      </w:pPr>
+      <w:r>
+        <w:rPr>
+          <w:sz w:val="22"/>
+          <w:szCs w:val="22"/>
+        </w:rPr>
+        <w:t xml:space="preserve">Communicate findings: whatever the learners choose for their output — paper for a poster, space for a</w:t>
+      </w:r>
+    </w:p>
+    <w:p>
+      <w:pPr>
+        <w:spacing w:after="120" w:before="0"/>
+      </w:pPr>
+      <w:r>
+        <w:rPr>
+          <w:sz w:val="22"/>
+          <w:szCs w:val="22"/>
+        </w:rPr>
+        <w:t xml:space="preserve">role-play, and time to rehearse.</w:t>
+      </w:r>
+    </w:p>
+    <w:p>
+      <w:pPr>
+        <w:pStyle w:val="ListParagraph"/>
+        <w:numPr>
+          <w:ilvl w:val="0"/>
+          <w:numId w:val="1"/>
+        </w:numPr>
+        <w:spacing w:after="60"/>
+      </w:pPr>
+      <w:r>
+        <w:rPr>
+          <w:sz w:val="22"/>
+          <w:szCs w:val="22"/>
+        </w:rPr>
+        <w:t xml:space="preserve">Showcase and reflect: a warm space and, if possible, the audience the learners chose to invite.</w:t>
+      </w:r>
+    </w:p>
+    <w:p>
+      <w:pPr>
+        <w:pStyle w:val="Heading2"/>
+        <w:spacing w:after="80" w:before="200"/>
+      </w:pPr>
+      <w:r>
+        <w:rPr>
+          <w:b/>
+          <w:bCs/>
+          <w:color w:val="7A3B69"/>
+          <w:sz w:val="26"/>
+          <w:szCs w:val="26"/>
+        </w:rPr>
+        <w:t xml:space="preserve">Running it with no screen or internet</w:t>
+      </w:r>
+    </w:p>
+    <w:p>
+      <w:pPr>
+        <w:pStyle w:val="ListParagraph"/>
+        <w:numPr>
+          <w:ilvl w:val="0"/>
+          <w:numId w:val="1"/>
+        </w:numPr>
+        <w:spacing w:after="60"/>
+      </w:pPr>
+      <w:r>
+        <w:rPr>
+          <w:sz w:val="22"/>
+          <w:szCs w:val="22"/>
+        </w:rPr>
+        <w:t xml:space="preserve">Everything is oral and visual first. Read sources aloud. Let learners answer in drawings, marks, and</w:t>
+      </w:r>
+    </w:p>
+    <w:p>
+      <w:pPr>
+        <w:spacing w:after="120" w:before="0"/>
+      </w:pPr>
+      <w:r>
+        <w:rPr>
+          <w:sz w:val="22"/>
+          <w:szCs w:val="22"/>
+        </w:rPr>
+        <w:t xml:space="preserve">a few words — neat writing is never required.</w:t>
+      </w:r>
+    </w:p>
+    <w:p>
+      <w:pPr>
+        <w:pStyle w:val="ListParagraph"/>
+        <w:numPr>
+          <w:ilvl w:val="0"/>
+          <w:numId w:val="1"/>
+        </w:numPr>
+        <w:spacing w:after="60"/>
+      </w:pPr>
+      <w:r>
+        <w:rPr>
+          <w:sz w:val="22"/>
+          <w:szCs w:val="22"/>
+        </w:rPr>
+        <w:t xml:space="preserve">The Student Workbook is designed to be printed and written in by hand. The source cards come at three</w:t>
+      </w:r>
+    </w:p>
+    <w:p>
+      <w:pPr>
+        <w:spacing w:after="120" w:before="0"/>
+      </w:pPr>
+      <w:r>
+        <w:rPr>
+          <w:sz w:val="22"/>
+          <w:szCs w:val="22"/>
+        </w:rPr>
+        <w:t xml:space="preserve">reading levels (a real article, a B1 version, a simpler A1/A2 version) so you can meet each learner.</w:t>
+      </w:r>
+    </w:p>
+    <w:p>
+      <w:pPr>
+        <w:pStyle w:val="ListParagraph"/>
+        <w:numPr>
+          <w:ilvl w:val="0"/>
+          <w:numId w:val="1"/>
+        </w:numPr>
+        <w:spacing w:after="60"/>
+      </w:pPr>
+      <w:r>
+        <w:rPr>
+          <w:sz w:val="22"/>
+          <w:szCs w:val="22"/>
+        </w:rPr>
+        <w:t xml:space="preserve">The research book is the spine of the whole course. It carries each learner's question, evidence, and</w:t>
+      </w:r>
+    </w:p>
+    <w:p>
+      <w:pPr>
+        <w:spacing w:after="120" w:before="0"/>
+      </w:pPr>
+      <w:r>
+        <w:rPr>
+          <w:sz w:val="22"/>
+          <w:szCs w:val="22"/>
+        </w:rPr>
+        <w:t xml:space="preserve">thinking from the first day to the last. A learner who misses a week can pick their book back up and see where they were — so protect it, and keep coming back to it.</w:t>
+      </w:r>
+    </w:p>
+    <w:p>
+      <w:pPr>
+        <w:pStyle w:val="ListParagraph"/>
+        <w:numPr>
+          <w:ilvl w:val="0"/>
+          <w:numId w:val="1"/>
+        </w:numPr>
+        <w:spacing w:after="60"/>
+      </w:pPr>
+      <w:r>
+        <w:rPr>
+          <w:sz w:val="22"/>
+          <w:szCs w:val="22"/>
+        </w:rPr>
+        <w:t xml:space="preserve">Times are generous on purpose. Oral and visual work, drawing, and translation take longer than they</w:t>
+      </w:r>
+    </w:p>
+    <w:p>
+      <w:pPr>
+        <w:spacing w:after="120" w:before="0"/>
+      </w:pPr>
+      <w:r>
+        <w:rPr>
+          <w:sz w:val="22"/>
+          <w:szCs w:val="22"/>
+        </w:rPr>
+        <w:t xml:space="preserve">look. It is fine to take two sessions over one block.</w:t>
+      </w:r>
+    </w:p>
+    <w:p>
+      <w:pPr>
+        <w:pStyle w:val="Heading2"/>
+        <w:spacing w:after="80" w:before="200"/>
+      </w:pPr>
+      <w:r>
+        <w:rPr>
+          <w:b/>
+          <w:bCs/>
+          <w:color w:val="7A3B69"/>
+          <w:sz w:val="26"/>
+          <w:szCs w:val="26"/>
+        </w:rPr>
+        <w:t xml:space="preserve">Pictures you will need to make</w:t>
+      </w:r>
+    </w:p>
+    <w:p>
+      <w:pPr>
+        <w:spacing w:after="120" w:before="0"/>
+      </w:pPr>
+      <w:r>
+        <w:rPr>
+          <w:sz w:val="22"/>
+          <w:szCs w:val="22"/>
+        </w:rPr>
+        <w:t xml:space="preserve">The course is visual, so a few simple pictures do a lot of work. You do not need an artist — a clear drawing, or a real photo if you have one, is enough. Prepare:</w:t>
+      </w:r>
+    </w:p>
+    <w:p>
+      <w:pPr>
+        <w:pStyle w:val="ListParagraph"/>
+        <w:numPr>
+          <w:ilvl w:val="0"/>
+          <w:numId w:val="1"/>
+        </w:numPr>
+        <w:spacing w:after="60"/>
+      </w:pPr>
+      <w:r>
+        <w:rPr>
+          <w:sz w:val="22"/>
+          <w:szCs w:val="22"/>
+        </w:rPr>
+        <w:t xml:space="preserve">The hills "before and now": one showing the hills full of trees, one showing bare slopes today.</w:t>
+      </w:r>
+    </w:p>
+    <w:p>
+      <w:pPr>
+        <w:pStyle w:val="ListParagraph"/>
+        <w:numPr>
+          <w:ilvl w:val="0"/>
+          <w:numId w:val="1"/>
+        </w:numPr>
+        <w:spacing w:after="60"/>
+      </w:pPr>
+      <w:r>
+        <w:rPr>
+          <w:sz w:val="22"/>
+          <w:szCs w:val="22"/>
+        </w:rPr>
+        <w:t xml:space="preserve">A simple picture for each research word on the word wall (the picture-word cards give you a blank box</w:t>
+      </w:r>
+    </w:p>
+    <w:p>
+      <w:pPr>
+        <w:spacing w:after="120" w:before="0"/>
+      </w:pPr>
+      <w:r>
+        <w:rPr>
+          <w:sz w:val="22"/>
+          <w:szCs w:val="22"/>
+        </w:rPr>
+        <w:t xml:space="preserve">to draw in): tree, hill, rain, root, bare slope, landslide, and so on.</w:t>
+      </w:r>
+    </w:p>
+    <w:p>
+      <w:pPr>
+        <w:pStyle w:val="ListParagraph"/>
+        <w:numPr>
+          <w:ilvl w:val="0"/>
+          <w:numId w:val="1"/>
+        </w:numPr>
+        <w:spacing w:after="60"/>
+      </w:pPr>
+      <w:r>
+        <w:rPr>
+          <w:sz w:val="22"/>
+          <w:szCs w:val="22"/>
+        </w:rPr>
+        <w:t xml:space="preserve">A simple picture for each source card if you can (a bare hill in the rain, roots holding soil, people</w:t>
+      </w:r>
+    </w:p>
+    <w:p>
+      <w:pPr>
+        <w:spacing w:after="120" w:before="0"/>
+      </w:pPr>
+      <w:r>
+        <w:rPr>
+          <w:sz w:val="22"/>
+          <w:szCs w:val="22"/>
+        </w:rPr>
+        <w:t xml:space="preserve">planting on a slope). These help learners who are not yet reading follow the source.</w:t>
+      </w:r>
+    </w:p>
+    <w:p>
+      <w:pPr>
+        <w:spacing w:after="120" w:before="0"/>
+      </w:pPr>
+      <w:r>
+        <w:rPr>
+          <w:sz w:val="22"/>
+          <w:szCs w:val="22"/>
+        </w:rPr>
+        <w:t xml:space="preserve">If your programme has an illustrator, these are the images to commission; until then, draw them with the group — making the picture is itself part of the learning.</w:t>
+      </w:r>
+    </w:p>
+    <w:p>
+      <w:r>
+        <w:br w:type="page"/>
+      </w:r>
+    </w:p>
+    <w:p>
+      <w:pPr>
+        <w:pStyle w:val="Heading1"/>
+        <w:spacing w:after="100" w:before="240"/>
+      </w:pPr>
+      <w:r>
+        <w:rPr>
+          <w:b/>
+          <w:bCs/>
+          <w:color w:val="1F3A5F"/>
+          <w:sz w:val="30"/>
+          <w:szCs w:val="30"/>
+        </w:rPr>
+        <w:t xml:space="preserve">Safeguarding and protection</w:t>
+      </w:r>
+    </w:p>
+    <w:p>
+      <w:pPr>
+        <w:pStyle w:val="Heading2"/>
+        <w:spacing w:after="80" w:before="200"/>
+      </w:pPr>
+      <w:r>
+        <w:rPr>
+          <w:b/>
+          <w:bCs/>
+          <w:color w:val="7A3B69"/>
+          <w:sz w:val="26"/>
+          <w:szCs w:val="26"/>
+        </w:rPr>
+        <w:t xml:space="preserve">Protection comes first</w:t>
+      </w:r>
+    </w:p>
+    <w:p>
+      <w:pPr>
+        <w:spacing w:after="120" w:before="0"/>
+      </w:pPr>
+      <w:r>
+        <w:rPr>
+          <w:sz w:val="22"/>
+          <w:szCs w:val="22"/>
+        </w:rPr>
+        <w:t xml:space="preserve">This component asks learners to investigate a real, local challenge and to talk with real people in their community. That is powerful, and it carries responsibility. Protection comes before the research, every time. Read this before you begin, agree the referral pathway with your programme, and follow NRC's Code of Conduct and protection principles throughout. If ever the research and a learner's safety or dignity pull against each other, safety wins — full stop.</w:t>
+      </w:r>
+    </w:p>
+    <w:p>
+      <w:pPr>
+        <w:pStyle w:val="Heading2"/>
+        <w:spacing w:after="80" w:before="200"/>
+      </w:pPr>
+      <w:r>
+        <w:rPr>
+          <w:b/>
+          <w:bCs/>
+          <w:color w:val="7A3B69"/>
+          <w:sz w:val="26"/>
+          <w:szCs w:val="26"/>
+        </w:rPr>
+        <w:t xml:space="preserve">Before you start</w:t>
+      </w:r>
+    </w:p>
+    <w:p>
+      <w:pPr>
+        <w:pStyle w:val="ListParagraph"/>
+        <w:numPr>
+          <w:ilvl w:val="0"/>
+          <w:numId w:val="1"/>
+        </w:numPr>
+        <w:spacing w:after="60"/>
+      </w:pPr>
+      <w:r>
+        <w:rPr>
+          <w:sz w:val="22"/>
+          <w:szCs w:val="22"/>
+        </w:rPr>
+        <w:t xml:space="preserve">Agree the referral pathway with your programme: who you turn to, and how, if a learner — or someone a</w:t>
+      </w:r>
+    </w:p>
+    <w:p>
+      <w:pPr>
+        <w:spacing w:after="120" w:before="0"/>
+      </w:pPr>
+      <w:r>
+        <w:rPr>
+          <w:sz w:val="22"/>
+          <w:szCs w:val="22"/>
+        </w:rPr>
+        <w:t xml:space="preserve">learner speaks to — is distressed, discloses harm, or is at risk. Have the names and the steps written down and to hand before the first session, not looked for in the moment.</w:t>
+      </w:r>
+    </w:p>
+    <w:p>
+      <w:pPr>
+        <w:pStyle w:val="ListParagraph"/>
+        <w:numPr>
+          <w:ilvl w:val="0"/>
+          <w:numId w:val="1"/>
+        </w:numPr>
+        <w:spacing w:after="60"/>
+      </w:pPr>
+      <w:r>
+        <w:rPr>
+          <w:sz w:val="22"/>
+          <w:szCs w:val="22"/>
+        </w:rPr>
+        <w:t xml:space="preserve">Know your step-back options: how a learner can pause, leave the space, or sit out an activity without</w:t>
+      </w:r>
+    </w:p>
+    <w:p>
+      <w:pPr>
+        <w:spacing w:after="120" w:before="0"/>
+      </w:pPr>
+      <w:r>
+        <w:rPr>
+          <w:sz w:val="22"/>
+          <w:szCs w:val="22"/>
+        </w:rPr>
+        <w:t xml:space="preserve">being singled out or questioned.</w:t>
+      </w:r>
+    </w:p>
+    <w:p>
+      <w:pPr>
+        <w:pStyle w:val="ListParagraph"/>
+        <w:numPr>
+          <w:ilvl w:val="0"/>
+          <w:numId w:val="1"/>
+        </w:numPr>
+        <w:spacing w:after="60"/>
+      </w:pPr>
+      <w:r>
+        <w:rPr>
+          <w:sz w:val="22"/>
+          <w:szCs w:val="22"/>
+        </w:rPr>
+        <w:t xml:space="preserve">Plan the fieldwork with the community, not alone (see "Girls and gathering" below).</w:t>
+      </w:r>
+    </w:p>
+    <w:p>
+      <w:pPr>
+        <w:pStyle w:val="Heading2"/>
+        <w:spacing w:after="80" w:before="200"/>
+      </w:pPr>
+      <w:r>
+        <w:rPr>
+          <w:b/>
+          <w:bCs/>
+          <w:color w:val="7A3B69"/>
+          <w:sz w:val="26"/>
+          <w:szCs w:val="26"/>
+        </w:rPr>
+        <w:t xml:space="preserve">The tone: hopeful, not disaster</w:t>
+      </w:r>
+    </w:p>
+    <w:p>
+      <w:pPr>
+        <w:spacing w:after="120" w:before="0"/>
+      </w:pPr>
+      <w:r>
+        <w:rPr>
+          <w:sz w:val="22"/>
+          <w:szCs w:val="22"/>
+        </w:rPr>
+        <w:t xml:space="preserve">The trees are a safe and hopeful subject — the land is greening again — and that is how to hold it. Keep the tone one of curiosity and care, not disaster. The subject does touch landslides and lost shelters, so keep watch for when it becomes personal, and steer gently back to the hills and the trees.</w:t>
+      </w:r>
+    </w:p>
+    <w:p>
+      <w:pPr>
+        <w:pStyle w:val="Heading2"/>
+        <w:spacing w:after="80" w:before="200"/>
+      </w:pPr>
+      <w:r>
+        <w:rPr>
+          <w:b/>
+          <w:bCs/>
+          <w:color w:val="7A3B69"/>
+          <w:sz w:val="26"/>
+          <w:szCs w:val="26"/>
+        </w:rPr>
+        <w:t xml:space="preserve">No learner speaks from their own life</w:t>
+      </w:r>
+    </w:p>
+    <w:p>
+      <w:pPr>
+        <w:spacing w:after="120" w:before="0"/>
+      </w:pPr>
+      <w:r>
+        <w:rPr>
+          <w:sz w:val="22"/>
+          <w:szCs w:val="22"/>
+        </w:rPr>
+        <w:t xml:space="preserve">No learner ever has to speak about their own experience of a landslide, a lost shelter, displacement, or loss. Every activity is designed so learners can take part fully by talking about the hills, the trees, and other people — never themselves. If a learner chooses to share something personal, receive it warmly, do not press for more, and follow up privately and through your referral pathway if needed.</w:t>
+      </w:r>
+    </w:p>
+    <w:p>
+      <w:pPr>
+        <w:pStyle w:val="Heading2"/>
+        <w:spacing w:after="80" w:before="200"/>
+      </w:pPr>
+      <w:r>
+        <w:rPr>
+          <w:b/>
+          <w:bCs/>
+          <w:color w:val="7A3B69"/>
+          <w:sz w:val="26"/>
+          <w:szCs w:val="26"/>
+        </w:rPr>
+        <w:t xml:space="preserve">Research ethics: consent and no names</w:t>
+      </w:r>
+    </w:p>
+    <w:p>
+      <w:pPr>
+        <w:spacing w:after="120" w:before="0"/>
+      </w:pPr>
+      <w:r>
+        <w:rPr>
+          <w:sz w:val="22"/>
+          <w:szCs w:val="22"/>
+        </w:rPr>
+        <w:t xml:space="preserve">Primary research means talking to real people, so ethics is the heart of the work, not a footnote. Teach and hold the consent routine every time:</w:t>
+      </w:r>
+    </w:p>
+    <w:p>
+      <w:pPr>
+        <w:pStyle w:val="ListParagraph"/>
+        <w:numPr>
+          <w:ilvl w:val="0"/>
+          <w:numId w:val="1"/>
+        </w:numPr>
+        <w:spacing w:after="60"/>
+      </w:pPr>
+      <w:r>
+        <w:rPr>
+          <w:sz w:val="22"/>
+          <w:szCs w:val="22"/>
+        </w:rPr>
+        <w:t xml:space="preserve">Ask before you ask: "May I ask you some questions?"</w:t>
+      </w:r>
+    </w:p>
+    <w:p>
+      <w:pPr>
+        <w:pStyle w:val="ListParagraph"/>
+        <w:numPr>
+          <w:ilvl w:val="0"/>
+          <w:numId w:val="1"/>
+        </w:numPr>
+        <w:spacing w:after="60"/>
+      </w:pPr>
+      <w:r>
+        <w:rPr>
+          <w:sz w:val="22"/>
+          <w:szCs w:val="22"/>
+        </w:rPr>
+        <w:t xml:space="preserve">Explain why you are asking.</w:t>
+      </w:r>
+    </w:p>
+    <w:p>
+      <w:pPr>
+        <w:pStyle w:val="ListParagraph"/>
+        <w:numPr>
+          <w:ilvl w:val="0"/>
+          <w:numId w:val="1"/>
+        </w:numPr>
+        <w:spacing w:after="60"/>
+      </w:pPr>
+      <w:r>
+        <w:rPr>
+          <w:sz w:val="22"/>
+          <w:szCs w:val="22"/>
+        </w:rPr>
+        <w:t xml:space="preserve">Let people say no, or stop at any time, with no pressure.</w:t>
+      </w:r>
+    </w:p>
+    <w:p>
+      <w:pPr>
+        <w:pStyle w:val="ListParagraph"/>
+        <w:numPr>
+          <w:ilvl w:val="0"/>
+          <w:numId w:val="1"/>
+        </w:numPr>
+        <w:spacing w:after="60"/>
+      </w:pPr>
+      <w:r>
+        <w:rPr>
+          <w:sz w:val="22"/>
+          <w:szCs w:val="22"/>
+        </w:rPr>
+        <w:t xml:space="preserve">Use no names — never record who said what.</w:t>
+      </w:r>
+    </w:p>
+    <w:p>
+      <w:pPr>
+        <w:pStyle w:val="ListParagraph"/>
+        <w:numPr>
+          <w:ilvl w:val="0"/>
+          <w:numId w:val="1"/>
+        </w:numPr>
+        <w:spacing w:after="60"/>
+      </w:pPr>
+      <w:r>
+        <w:rPr>
+          <w:sz w:val="22"/>
+          <w:szCs w:val="22"/>
+        </w:rPr>
+        <w:t xml:space="preserve">Put no one at risk to get an answer, including yourself.</w:t>
+      </w:r>
+    </w:p>
+    <w:p>
+      <w:pPr>
+        <w:spacing w:after="120" w:before="0"/>
+      </w:pPr>
+      <w:r>
+        <w:rPr>
+          <w:sz w:val="22"/>
+          <w:szCs w:val="22"/>
+        </w:rPr>
+        <w:t xml:space="preserve">Protect the people learners speak to as carefully as the learners themselves: anonymity, consent, and do no harm.</w:t>
+      </w:r>
+    </w:p>
+    <w:p>
+      <w:pPr>
+        <w:pStyle w:val="Heading2"/>
+        <w:spacing w:after="80" w:before="200"/>
+      </w:pPr>
+      <w:r>
+        <w:rPr>
+          <w:b/>
+          <w:bCs/>
+          <w:color w:val="7A3B69"/>
+          <w:sz w:val="26"/>
+          <w:szCs w:val="26"/>
+        </w:rPr>
+        <w:t xml:space="preserve">Girls and gathering</w:t>
+      </w:r>
+    </w:p>
+    <w:p>
+      <w:pPr>
+        <w:spacing w:after="120" w:before="0"/>
+      </w:pPr>
+      <w:r>
+        <w:rPr>
+          <w:sz w:val="22"/>
+          <w:szCs w:val="22"/>
+        </w:rPr>
+        <w:t xml:space="preserve">In this community, adolescent girls being seen in public, or approaching people they do not know, can be unsafe or not culturally accepted — and it is a real reason girls drop out. So do not send girls out to gather the same way as boys. Plan gathering that fits, with the community:</w:t>
+      </w:r>
+    </w:p>
+    <w:p>
+      <w:pPr>
+        <w:pStyle w:val="ListParagraph"/>
+        <w:numPr>
+          <w:ilvl w:val="0"/>
+          <w:numId w:val="1"/>
+        </w:numPr>
+        <w:spacing w:after="60"/>
+      </w:pPr>
+      <w:r>
+        <w:rPr>
+          <w:sz w:val="22"/>
+          <w:szCs w:val="22"/>
+        </w:rPr>
+        <w:t xml:space="preserve">Girls gather from people in their own home and from women in their close networks.</w:t>
+      </w:r>
+    </w:p>
+    <w:p>
+      <w:pPr>
+        <w:pStyle w:val="ListParagraph"/>
+        <w:numPr>
+          <w:ilvl w:val="0"/>
+          <w:numId w:val="1"/>
+        </w:numPr>
+        <w:spacing w:after="60"/>
+      </w:pPr>
+      <w:r>
+        <w:rPr>
+          <w:sz w:val="22"/>
+          <w:szCs w:val="22"/>
+        </w:rPr>
+        <w:t xml:space="preserve">Or girls gather accompanied by a female facilitator or a trusted female relative.</w:t>
+      </w:r>
+    </w:p>
+    <w:p>
+      <w:pPr>
+        <w:pStyle w:val="ListParagraph"/>
+        <w:numPr>
+          <w:ilvl w:val="0"/>
+          <w:numId w:val="1"/>
+        </w:numPr>
+        <w:spacing w:after="60"/>
+      </w:pPr>
+      <w:r>
+        <w:rPr>
+          <w:sz w:val="22"/>
+          <w:szCs w:val="22"/>
+        </w:rPr>
+        <w:t xml:space="preserve">Or girls contribute through careful observation and through the evidence the group gathers together.</w:t>
+      </w:r>
+    </w:p>
+    <w:p>
+      <w:pPr>
+        <w:spacing w:after="120" w:before="0"/>
+      </w:pPr>
+      <w:r>
+        <w:rPr>
+          <w:sz w:val="22"/>
+          <w:szCs w:val="22"/>
+        </w:rPr>
+        <w:t xml:space="preserve">The aim is that no learner is left out of the investigation because of how gathering is arranged. Use same-gender pairs throughout, and a female facilitator wherever girls' participation depends on it.</w:t>
+      </w:r>
+    </w:p>
+    <w:p>
+      <w:pPr>
+        <w:pStyle w:val="Heading2"/>
+        <w:spacing w:after="80" w:before="200"/>
+      </w:pPr>
+      <w:r>
+        <w:rPr>
+          <w:b/>
+          <w:bCs/>
+          <w:color w:val="7A3B69"/>
+          <w:sz w:val="26"/>
+          <w:szCs w:val="26"/>
+        </w:rPr>
+        <w:t xml:space="preserve">If a learner becomes distressed</w:t>
+      </w:r>
+    </w:p>
+    <w:p>
+      <w:pPr>
+        <w:pStyle w:val="ListParagraph"/>
+        <w:numPr>
+          <w:ilvl w:val="0"/>
+          <w:numId w:val="1"/>
+        </w:numPr>
+        <w:spacing w:after="60"/>
+      </w:pPr>
+      <w:r>
+        <w:rPr>
+          <w:sz w:val="22"/>
+          <w:szCs w:val="22"/>
+        </w:rPr>
+        <w:t xml:space="preserve">Stop the activity for that learner. Do not press them to continue or to explain.</w:t>
+      </w:r>
+    </w:p>
+    <w:p>
+      <w:pPr>
+        <w:pStyle w:val="ListParagraph"/>
+        <w:numPr>
+          <w:ilvl w:val="0"/>
+          <w:numId w:val="1"/>
+        </w:numPr>
+        <w:spacing w:after="60"/>
+      </w:pPr>
+      <w:r>
+        <w:rPr>
+          <w:sz w:val="22"/>
+          <w:szCs w:val="22"/>
+        </w:rPr>
+        <w:t xml:space="preserve">Offer a quiet break and a calm, familiar presence. Let a friend sit with them if that helps.</w:t>
+      </w:r>
+    </w:p>
+    <w:p>
+      <w:pPr>
+        <w:pStyle w:val="ListParagraph"/>
+        <w:numPr>
+          <w:ilvl w:val="0"/>
+          <w:numId w:val="1"/>
+        </w:numPr>
+        <w:spacing w:after="60"/>
+      </w:pPr>
+      <w:r>
+        <w:rPr>
+          <w:sz w:val="22"/>
+          <w:szCs w:val="22"/>
+        </w:rPr>
+        <w:t xml:space="preserve">Do not probe for details. Listen if they choose to speak; reassure them it was right to.</w:t>
+      </w:r>
+    </w:p>
+    <w:p>
+      <w:pPr>
+        <w:pStyle w:val="ListParagraph"/>
+        <w:numPr>
+          <w:ilvl w:val="0"/>
+          <w:numId w:val="1"/>
+        </w:numPr>
+        <w:spacing w:after="60"/>
+      </w:pPr>
+      <w:r>
+        <w:rPr>
+          <w:sz w:val="22"/>
+          <w:szCs w:val="22"/>
+        </w:rPr>
+        <w:t xml:space="preserve">Follow up privately, and use your referral pathway for anything beyond ordinary upset.</w:t>
+      </w:r>
+    </w:p>
+    <w:p>
+      <w:pPr>
+        <w:pStyle w:val="ListParagraph"/>
+        <w:numPr>
+          <w:ilvl w:val="0"/>
+          <w:numId w:val="1"/>
+        </w:numPr>
+        <w:spacing w:after="60"/>
+      </w:pPr>
+      <w:r>
+        <w:rPr>
+          <w:sz w:val="22"/>
+          <w:szCs w:val="22"/>
+        </w:rPr>
+        <w:t xml:space="preserve">Look after yourself too, and debrief with a colleague — this work can be heavy.</w:t>
+      </w:r>
+    </w:p>
+    <w:p>
+      <w:pPr>
+        <w:pStyle w:val="Heading2"/>
+        <w:spacing w:after="80" w:before="200"/>
+      </w:pPr>
+      <w:r>
+        <w:rPr>
+          <w:b/>
+          <w:bCs/>
+          <w:color w:val="7A3B69"/>
+          <w:sz w:val="26"/>
+          <w:szCs w:val="26"/>
+        </w:rPr>
+        <w:t xml:space="preserve">When gathering is disrupted</w:t>
+      </w:r>
+    </w:p>
+    <w:p>
+      <w:pPr>
+        <w:spacing w:after="120" w:before="0"/>
+      </w:pPr>
+      <w:r>
+        <w:rPr>
+          <w:sz w:val="22"/>
+          <w:szCs w:val="22"/>
+        </w:rPr>
+        <w:t xml:space="preserve">Fires, illness, a week kept indoors — disruption is normal here. Adapting the plan and picking the investigation up again is part of the skill, not a failure. Never let the pressure to gather evidence push a learner somewhere unsafe.</w:t>
       </w:r>
     </w:p>
     <w:p>
@@ -10048,6 +11285,595 @@
         </w:pBdr>
         <w:spacing w:after="120"/>
       </w:pPr>
+    </w:p>
+    <w:p>
+      <w:r>
+        <w:br w:type="page"/>
+      </w:r>
+    </w:p>
+    <w:p>
+      <w:pPr>
+        <w:pStyle w:val="Heading1"/>
+        <w:spacing w:after="100" w:before="240"/>
+      </w:pPr>
+      <w:r>
+        <w:rPr>
+          <w:b/>
+          <w:bCs/>
+          <w:color w:val="1F3A5F"/>
+          <w:sz w:val="30"/>
+          <w:szCs w:val="30"/>
+        </w:rPr>
+        <w:t xml:space="preserve">Assessing the investigation (FSI1)</w:t>
+      </w:r>
+    </w:p>
+    <w:p>
+      <w:pPr>
+        <w:pStyle w:val="Heading2"/>
+        <w:spacing w:after="80" w:before="200"/>
+      </w:pPr>
+      <w:r>
+        <w:rPr>
+          <w:b/>
+          <w:bCs/>
+          <w:color w:val="7A3B69"/>
+          <w:sz w:val="26"/>
+          <w:szCs w:val="26"/>
+        </w:rPr>
+        <w:t xml:space="preserve">What is assessed, and how</w:t>
+      </w:r>
+    </w:p>
+    <w:p>
+      <w:pPr>
+        <w:spacing w:after="120" w:before="0"/>
+      </w:pPr>
+      <w:r>
+        <w:rPr>
+          <w:sz w:val="22"/>
+          <w:szCs w:val="22"/>
+        </w:rPr>
+        <w:t xml:space="preserve">This component develops and demonstrates one anchor competency: FSI1, Investigate real-world issues — "the learner can conduct primary and secondary research into challenges affecting people and the planet to develop actionable insights." On Learning Bridge+ this is one of the two certificated competencies, so the judgement matters.</w:t>
+      </w:r>
+    </w:p>
+    <w:p>
+      <w:pPr>
+        <w:spacing w:after="120" w:before="0"/>
+      </w:pPr>
+      <w:r>
+        <w:rPr>
+          <w:sz w:val="22"/>
+          <w:szCs w:val="22"/>
+        </w:rPr>
+        <w:t xml:space="preserve">You judge each learner's proficiency by your own professional judgement against Amala's proficiency scale, built up from evidence gathered across the whole investigation. You do NOT mark it from the final output alone: a learner who made a beautiful poster but could not turn evidence into an insight, and one who reached a defensible insight from messy evidence, are showing different proficiency, even with similar-looking posters.</w:t>
+      </w:r>
+    </w:p>
+    <w:p>
+      <w:pPr>
+        <w:spacing w:after="120" w:before="0"/>
+      </w:pPr>
+      <w:r>
+        <w:rPr>
+          <w:sz w:val="22"/>
+          <w:szCs w:val="22"/>
+        </w:rPr>
+        <w:t xml:space="preserve">Assess at two points:</w:t>
+      </w:r>
+    </w:p>
+    <w:p>
+      <w:pPr>
+        <w:pStyle w:val="ListParagraph"/>
+        <w:numPr>
+          <w:ilvl w:val="0"/>
+          <w:numId w:val="1"/>
+        </w:numPr>
+        <w:spacing w:after="60"/>
+      </w:pPr>
+      <w:r>
+        <w:rPr>
+          <w:sz w:val="22"/>
+          <w:szCs w:val="22"/>
+        </w:rPr>
+        <w:t xml:space="preserve">Midway (formative), around the end of the "Plan and conduct research" phase — to see where each</w:t>
+      </w:r>
+    </w:p>
+    <w:p>
+      <w:pPr>
+        <w:spacing w:after="120" w:before="0"/>
+      </w:pPr>
+      <w:r>
+        <w:rPr>
+          <w:sz w:val="22"/>
+          <w:szCs w:val="22"/>
+        </w:rPr>
+        <w:t xml:space="preserve">learner is and adjust your support.</w:t>
+      </w:r>
+    </w:p>
+    <w:p>
+      <w:pPr>
+        <w:pStyle w:val="ListParagraph"/>
+        <w:numPr>
+          <w:ilvl w:val="0"/>
+          <w:numId w:val="1"/>
+        </w:numPr>
+        <w:spacing w:after="60"/>
+      </w:pPr>
+      <w:r>
+        <w:rPr>
+          <w:sz w:val="22"/>
+          <w:szCs w:val="22"/>
+        </w:rPr>
+        <w:t xml:space="preserve">At the end (summative), during the showcase — the judgement that informs the readiness decision.</w:t>
+      </w:r>
+    </w:p>
+    <w:p>
+      <w:pPr>
+        <w:spacing w:after="120" w:before="0"/>
+      </w:pPr>
+      <w:r>
+        <w:rPr>
+          <w:sz w:val="22"/>
+          <w:szCs w:val="22"/>
+        </w:rPr>
+        <w:t xml:space="preserve">Do not over-assess. Two considered judgements, built from evidence gathered over time, are worth far more than repeated testing, which this cohort does not need and should not carry.</w:t>
+      </w:r>
+    </w:p>
+    <w:p>
+      <w:pPr>
+        <w:pStyle w:val="Heading2"/>
+        <w:spacing w:after="80" w:before="200"/>
+      </w:pPr>
+      <w:r>
+        <w:rPr>
+          <w:b/>
+          <w:bCs/>
+          <w:color w:val="7A3B69"/>
+          <w:sz w:val="26"/>
+          <w:szCs w:val="26"/>
+        </w:rPr>
+        <w:t xml:space="preserve">What FSI1 looks like across the research cycle</w:t>
+      </w:r>
+    </w:p>
+    <w:p>
+      <w:pPr>
+        <w:spacing w:after="120" w:before="0"/>
+      </w:pPr>
+      <w:r>
+        <w:rPr>
+          <w:sz w:val="22"/>
+          <w:szCs w:val="22"/>
+        </w:rPr>
+        <w:t xml:space="preserve">Look for the whole cycle, not one moment. A proficient investigator, at this level:</w:t>
+      </w:r>
+    </w:p>
+    <w:p>
+      <w:pPr>
+        <w:pStyle w:val="ListParagraph"/>
+        <w:numPr>
+          <w:ilvl w:val="0"/>
+          <w:numId w:val="1"/>
+        </w:numPr>
+        <w:spacing w:after="60"/>
+      </w:pPr>
+      <w:r>
+        <w:rPr>
+          <w:sz w:val="22"/>
+          <w:szCs w:val="22"/>
+        </w:rPr>
+        <w:t xml:space="preserve">Frames a researchable focus — makes the given question their own and turns it into things they can</w:t>
+      </w:r>
+    </w:p>
+    <w:p>
+      <w:pPr>
+        <w:spacing w:after="120" w:before="0"/>
+      </w:pPr>
+      <w:r>
+        <w:rPr>
+          <w:sz w:val="22"/>
+          <w:szCs w:val="22"/>
+        </w:rPr>
+        <w:t xml:space="preserve">actually find out.</w:t>
+      </w:r>
+    </w:p>
+    <w:p>
+      <w:pPr>
+        <w:pStyle w:val="ListParagraph"/>
+        <w:numPr>
+          <w:ilvl w:val="0"/>
+          <w:numId w:val="1"/>
+        </w:numPr>
+        <w:spacing w:after="60"/>
+      </w:pPr>
+      <w:r>
+        <w:rPr>
+          <w:sz w:val="22"/>
+          <w:szCs w:val="22"/>
+        </w:rPr>
+        <w:t xml:space="preserve">Gathers evidence ethically — asks and looks (primary) and reads the source pack (secondary), with</w:t>
+      </w:r>
+    </w:p>
+    <w:p>
+      <w:pPr>
+        <w:spacing w:after="120" w:before="0"/>
+      </w:pPr>
+      <w:r>
+        <w:rPr>
+          <w:sz w:val="22"/>
+          <w:szCs w:val="22"/>
+        </w:rPr>
+        <w:t xml:space="preserve">consent and no names.</w:t>
+      </w:r>
+    </w:p>
+    <w:p>
+      <w:pPr>
+        <w:pStyle w:val="ListParagraph"/>
+        <w:numPr>
+          <w:ilvl w:val="0"/>
+          <w:numId w:val="1"/>
+        </w:numPr>
+        <w:spacing w:after="60"/>
+      </w:pPr>
+      <w:r>
+        <w:rPr>
+          <w:sz w:val="22"/>
+          <w:szCs w:val="22"/>
+        </w:rPr>
+        <w:t xml:space="preserve">Weighs the evidence — checks a source against others and against what they found, rather than</w:t>
+      </w:r>
+    </w:p>
+    <w:p>
+      <w:pPr>
+        <w:spacing w:after="120" w:before="0"/>
+      </w:pPr>
+      <w:r>
+        <w:rPr>
+          <w:sz w:val="22"/>
+          <w:szCs w:val="22"/>
+        </w:rPr>
+        <w:t xml:space="preserve">believing whatever sounded good.</w:t>
+      </w:r>
+    </w:p>
+    <w:p>
+      <w:pPr>
+        <w:pStyle w:val="ListParagraph"/>
+        <w:numPr>
+          <w:ilvl w:val="0"/>
+          <w:numId w:val="1"/>
+        </w:numPr>
+        <w:spacing w:after="60"/>
+      </w:pPr>
+      <w:r>
+        <w:rPr>
+          <w:sz w:val="22"/>
+          <w:szCs w:val="22"/>
+        </w:rPr>
+        <w:t xml:space="preserve">Develops actionable insight — moves from "what the evidence says" to "what it means, and why it</w:t>
+      </w:r>
+    </w:p>
+    <w:p>
+      <w:pPr>
+        <w:spacing w:after="120" w:before="0"/>
+      </w:pPr>
+      <w:r>
+        <w:rPr>
+          <w:sz w:val="22"/>
+          <w:szCs w:val="22"/>
+        </w:rPr>
+        <w:t xml:space="preserve">matters," backed by evidence.</w:t>
+      </w:r>
+    </w:p>
+    <w:p>
+      <w:pPr>
+        <w:pStyle w:val="ListParagraph"/>
+        <w:numPr>
+          <w:ilvl w:val="0"/>
+          <w:numId w:val="1"/>
+        </w:numPr>
+        <w:spacing w:after="60"/>
+      </w:pPr>
+      <w:r>
+        <w:rPr>
+          <w:sz w:val="22"/>
+          <w:szCs w:val="22"/>
+        </w:rPr>
+        <w:t xml:space="preserve">Communicates it — shares findings honestly, including their limits, and answers questions about them.</w:t>
+      </w:r>
+    </w:p>
+    <w:p>
+      <w:pPr>
+        <w:pStyle w:val="Heading2"/>
+        <w:spacing w:after="80" w:before="200"/>
+      </w:pPr>
+      <w:r>
+        <w:rPr>
+          <w:b/>
+          <w:bCs/>
+          <w:color w:val="7A3B69"/>
+          <w:sz w:val="26"/>
+          <w:szCs w:val="26"/>
+        </w:rPr>
+        <w:t xml:space="preserve">The proficiency scale</w:t>
+      </w:r>
+    </w:p>
+    <w:p>
+      <w:pPr>
+        <w:spacing w:after="120" w:before="0"/>
+      </w:pPr>
+      <w:r>
+        <w:rPr>
+          <w:sz w:val="22"/>
+          <w:szCs w:val="22"/>
+        </w:rPr>
+        <w:t xml:space="preserve">A working scale for FSI1 in this component. Align it to Amala's official proficiency scale before certification; the bands below are written to match its usual shape.</w:t>
+      </w:r>
+    </w:p>
+    <w:p>
+      <w:pPr>
+        <w:pStyle w:val="ListParagraph"/>
+        <w:numPr>
+          <w:ilvl w:val="0"/>
+          <w:numId w:val="1"/>
+        </w:numPr>
+        <w:spacing w:after="60"/>
+      </w:pPr>
+      <w:r>
+        <w:rPr>
+          <w:sz w:val="22"/>
+          <w:szCs w:val="22"/>
+        </w:rPr>
+        <w:t xml:space="preserve">Emerging: takes part in the investigation with support. Can say what we are finding out and gather a</w:t>
+      </w:r>
+    </w:p>
+    <w:p>
+      <w:pPr>
+        <w:spacing w:after="120" w:before="0"/>
+      </w:pPr>
+      <w:r>
+        <w:rPr>
+          <w:sz w:val="22"/>
+          <w:szCs w:val="22"/>
+        </w:rPr>
+        <w:t xml:space="preserve">piece of evidence when guided, but leans on the facilitator to frame, weigh, and interpret.</w:t>
+      </w:r>
+    </w:p>
+    <w:p>
+      <w:pPr>
+        <w:pStyle w:val="ListParagraph"/>
+        <w:numPr>
+          <w:ilvl w:val="0"/>
+          <w:numId w:val="1"/>
+        </w:numPr>
+        <w:spacing w:after="60"/>
+      </w:pPr>
+      <w:r>
+        <w:rPr>
+          <w:sz w:val="22"/>
+          <w:szCs w:val="22"/>
+        </w:rPr>
+        <w:t xml:space="preserve">Developing: carries out parts of the cycle with less support — gathers evidence, sorts it, and</w:t>
+      </w:r>
+    </w:p>
+    <w:p>
+      <w:pPr>
+        <w:spacing w:after="120" w:before="0"/>
+      </w:pPr>
+      <w:r>
+        <w:rPr>
+          <w:sz w:val="22"/>
+          <w:szCs w:val="22"/>
+        </w:rPr>
+        <w:t xml:space="preserve">begins to weigh how far to trust it, but may still jump from a single source to a claim.</w:t>
+      </w:r>
+    </w:p>
+    <w:p>
+      <w:pPr>
+        <w:pStyle w:val="ListParagraph"/>
+        <w:numPr>
+          <w:ilvl w:val="0"/>
+          <w:numId w:val="1"/>
+        </w:numPr>
+        <w:spacing w:after="60"/>
+      </w:pPr>
+      <w:r>
+        <w:rPr>
+          <w:sz w:val="22"/>
+          <w:szCs w:val="22"/>
+        </w:rPr>
+        <w:t xml:space="preserve">Proficient: runs the whole cycle for the shared question with growing independence — frames what to</w:t>
+      </w:r>
+    </w:p>
+    <w:p>
+      <w:pPr>
+        <w:spacing w:after="120" w:before="0"/>
+      </w:pPr>
+      <w:r>
+        <w:rPr>
+          <w:sz w:val="22"/>
+          <w:szCs w:val="22"/>
+        </w:rPr>
+        <w:t xml:space="preserve">find out, gathers and weighs evidence (checking sources against each other and their own findings), and reaches an insight they can point to the evidence for, and communicate.</w:t>
+      </w:r>
+    </w:p>
+    <w:p>
+      <w:pPr>
+        <w:pStyle w:val="ListParagraph"/>
+        <w:numPr>
+          <w:ilvl w:val="0"/>
+          <w:numId w:val="1"/>
+        </w:numPr>
+        <w:spacing w:after="60"/>
+      </w:pPr>
+      <w:r>
+        <w:rPr>
+          <w:sz w:val="22"/>
+          <w:szCs w:val="22"/>
+        </w:rPr>
+        <w:t xml:space="preserve">Extending: does the above and more — notices where the evidence is thin or disagrees, treats their</w:t>
+      </w:r>
+    </w:p>
+    <w:p>
+      <w:pPr>
+        <w:spacing w:after="120" w:before="0"/>
+      </w:pPr>
+      <w:r>
+        <w:rPr>
+          <w:sz w:val="22"/>
+          <w:szCs w:val="22"/>
+        </w:rPr>
+        <w:t xml:space="preserve">own knowledge critically, asks a sharper question of their own, and helps others weigh evidence.</w:t>
+      </w:r>
+    </w:p>
+    <w:p>
+      <w:pPr>
+        <w:pStyle w:val="Heading2"/>
+        <w:spacing w:after="80" w:before="200"/>
+      </w:pPr>
+      <w:r>
+        <w:rPr>
+          <w:b/>
+          <w:bCs/>
+          <w:color w:val="7A3B69"/>
+          <w:sz w:val="26"/>
+          <w:szCs w:val="26"/>
+        </w:rPr>
+        <w:t xml:space="preserve">Where to find the evidence (in the research book)</w:t>
+      </w:r>
+    </w:p>
+    <w:p>
+      <w:pPr>
+        <w:spacing w:after="120" w:before="0"/>
+      </w:pPr>
+      <w:r>
+        <w:rPr>
+          <w:sz w:val="22"/>
+          <w:szCs w:val="22"/>
+        </w:rPr>
+        <w:t xml:space="preserve">All of it lives in the learner's research book and in how they talk about their work:</w:t>
+      </w:r>
+    </w:p>
+    <w:p>
+      <w:pPr>
+        <w:pStyle w:val="ListParagraph"/>
+        <w:numPr>
+          <w:ilvl w:val="0"/>
+          <w:numId w:val="1"/>
+        </w:numPr>
+        <w:spacing w:after="60"/>
+      </w:pPr>
+      <w:r>
+        <w:rPr>
+          <w:sz w:val="22"/>
+          <w:szCs w:val="22"/>
+        </w:rPr>
+        <w:t xml:space="preserve">The question and plan they framed, and their sub-questions.</w:t>
+      </w:r>
+    </w:p>
+    <w:p>
+      <w:pPr>
+        <w:pStyle w:val="ListParagraph"/>
+        <w:numPr>
+          <w:ilvl w:val="0"/>
+          <w:numId w:val="1"/>
+        </w:numPr>
+        <w:spacing w:after="60"/>
+      </w:pPr>
+      <w:r>
+        <w:rPr>
+          <w:sz w:val="22"/>
+          <w:szCs w:val="22"/>
+        </w:rPr>
+        <w:t xml:space="preserve">The interview and survey questions they designed.</w:t>
+      </w:r>
+    </w:p>
+    <w:p>
+      <w:pPr>
+        <w:pStyle w:val="ListParagraph"/>
+        <w:numPr>
+          <w:ilvl w:val="0"/>
+          <w:numId w:val="1"/>
+        </w:numPr>
+        <w:spacing w:after="60"/>
+      </w:pPr>
+      <w:r>
+        <w:rPr>
+          <w:sz w:val="22"/>
+          <w:szCs w:val="22"/>
+        </w:rPr>
+        <w:t xml:space="preserve">The evidence log, and how they marked how far to trust each piece.</w:t>
+      </w:r>
+    </w:p>
+    <w:p>
+      <w:pPr>
+        <w:pStyle w:val="ListParagraph"/>
+        <w:numPr>
+          <w:ilvl w:val="0"/>
+          <w:numId w:val="1"/>
+        </w:numPr>
+        <w:spacing w:after="60"/>
+      </w:pPr>
+      <w:r>
+        <w:rPr>
+          <w:sz w:val="22"/>
+          <w:szCs w:val="22"/>
+        </w:rPr>
+        <w:t xml:space="preserve">The move from findings to insight — their insight statements and the evidence behind them.</w:t>
+      </w:r>
+    </w:p>
+    <w:p>
+      <w:pPr>
+        <w:pStyle w:val="ListParagraph"/>
+        <w:numPr>
+          <w:ilvl w:val="0"/>
+          <w:numId w:val="1"/>
+        </w:numPr>
+        <w:spacing w:after="60"/>
+      </w:pPr>
+      <w:r>
+        <w:rPr>
+          <w:sz w:val="22"/>
+          <w:szCs w:val="22"/>
+        </w:rPr>
+        <w:t xml:space="preserve">The final research output, and how they answer questions about it.</w:t>
+      </w:r>
+    </w:p>
+    <w:p>
+      <w:pPr>
+        <w:pStyle w:val="Heading2"/>
+        <w:spacing w:after="80" w:before="200"/>
+      </w:pPr>
+      <w:r>
+        <w:rPr>
+          <w:b/>
+          <w:bCs/>
+          <w:color w:val="7A3B69"/>
+          <w:sz w:val="26"/>
+          <w:szCs w:val="26"/>
+        </w:rPr>
+        <w:t xml:space="preserve">Making the judgement</w:t>
+      </w:r>
+    </w:p>
+    <w:p>
+      <w:pPr>
+        <w:spacing w:after="120" w:before="0"/>
+      </w:pPr>
+      <w:r>
+        <w:rPr>
+          <w:sz w:val="22"/>
+          <w:szCs w:val="22"/>
+        </w:rPr>
+        <w:t xml:space="preserve">Read across all of that and place the learner on the scale as a whole — do not average a checklist. Weight the analytical heart most: gathering evidence is necessary, but turning it into a defensible, evidence-backed insight is what FSI1 is really about. Where a learner is disrupted (a missed week, a fire), judge the proficiency they show when they are there, not their attendance.</w:t>
+      </w:r>
+    </w:p>
+    <w:p>
+      <w:pPr>
+        <w:spacing w:after="120" w:before="0"/>
+      </w:pPr>
+      <w:r>
+        <w:rPr>
+          <w:sz w:val="22"/>
+          <w:szCs w:val="22"/>
+        </w:rPr>
+        <w:t xml:space="preserve">Use the printable rubric (a copy per learner) to record, at each point, where the learner sits on the scale and one or two lines of evidence for why — developmental notes, not a grade.</w:t>
+      </w:r>
     </w:p>
     <w:p>
       <w:r>

</xml_diff>

<commit_message>
content: add root-cause and power/beliefs analysis activities, and a compare method
From educator feedback (Kurshed, Anjali) asking for explicit root-cause work and
a deeper look at agency, beliefs, and who is helped or hurt.

- cb-rp-root-cause ("Dig for the root cause"): the Five Whys (problem tree noted
  as an alternative) to get past a surface problem to its root, each why resting
  on the evidence, never on blame. + worksheet cb-rp-our-root-cause.
- cb-rp-looking-deeper ("Who, what, and why"): three critical lenses — who/what
  has power, what beliefs and attitudes shape it, who is helped or hurt. +
  worksheet cb-rp-looking-deeper-page.
- Both wired into the Evaluate phase as a "one or more ways to analyse" toolkit;
  component now 54h (33 facilitated + 21 independent).
- Fold the compare-a-green-place-and-a-bare-place observation into Go and gather.

Co-Authored-By: Claude Opus 4.8 <noreply@anthropic.com>
</commit_message>
<xml_diff>
--- a/public/downloads/research-project-facilitator-unit-plan.docx
+++ b/public/downloads/research-project-facilitator-unit-plan.docx
@@ -54,7 +54,7 @@
           <w:sz w:val="22"/>
           <w:szCs w:val="22"/>
         </w:rPr>
-        <w:t xml:space="preserve">The full 50-hour plan for delivering the Research Project component fully offline in the Cox's Bazar camps, as a standalone course. It is set out in hours, not weeks, so you can fit it into your own timetable over a minimum of 10 weeks. The whole cohort investigates one shared, local challenge — what is happening to the trees on the hills where they live — working from a research question they are given: "What happens to our hills without trees, and what changes when trees and plants grow back?" Learners make that question their own, gather evidence through primary research in their community and through a supplied pack of secondary sources about how trees, soil, rain, and heat work, weigh what they find, and turn it into insights they share. Because there is no internet, all secondary sources are supplied ready-made. Times are deliberately generous, because oral and visual delivery with drawing and translation takes longer than it first appears.</w:t>
+        <w:t xml:space="preserve">The full 54-hour plan for delivering the Research Project component fully offline in the Cox's Bazar camps, as a standalone course. It is set out in hours, not weeks, so you can fit it into your own timetable over a minimum of 10 weeks. The whole cohort investigates one shared, local challenge — what is happening to the trees on the hills where they live — working from a research question they are given: "What happens to our hills without trees, and what changes when trees and plants grow back?" Learners make that question their own, gather evidence through primary research in their community and through a supplied pack of secondary sources about how trees, soil, rain, and heat work, weigh what they find, and turn it into insights they share. Because there is no internet, all secondary sources are supplied ready-made. Times are deliberately generous, because oral and visual delivery with drawing and translation takes longer than it first appears.</w:t>
       </w:r>
     </w:p>
     <w:p>
@@ -69,7 +69,7 @@
           <w:sz w:val="22"/>
           <w:szCs w:val="22"/>
         </w:rPr>
-        <w:t xml:space="preserve">50 hours total</w:t>
+        <w:t xml:space="preserve">54 hours total</w:t>
       </w:r>
       <w:r>
         <w:rPr>
@@ -77,7 +77,7 @@
           <w:sz w:val="22"/>
           <w:szCs w:val="22"/>
         </w:rPr>
-        <w:t xml:space="preserve">   ·   30h in-person  ·  20h independent  ·  set out in hours, fit your own schedule (min. 10 weeks)</w:t>
+        <w:t xml:space="preserve">   ·   33h in-person  ·  21h independent  ·  set out in hours, fit your own schedule (min. 10 weeks)</w:t>
       </w:r>
     </w:p>
     <w:p>
@@ -7039,6 +7039,23 @@
           <w:sz w:val="22"/>
           <w:szCs w:val="22"/>
         </w:rPr>
+        <w:t xml:space="preserve">Compare a green place and a bare place — look at both and notice the differences (which is cooler, which has firm soil, where the water runs), the good and the bad of each.</w:t>
+      </w:r>
+    </w:p>
+    <w:p>
+      <w:pPr>
+        <w:pStyle w:val="ListParagraph"/>
+        <w:numPr>
+          <w:ilvl w:val="0"/>
+          <w:numId w:val="1"/>
+        </w:numPr>
+        <w:spacing w:after="60"/>
+      </w:pPr>
+      <w:r>
+        <w:rPr>
+          <w:sz w:val="22"/>
+          <w:szCs w:val="22"/>
+        </w:rPr>
         <w:t xml:space="preserve">Record what they find in the research book, with marks, drawings, and a few words.</w:t>
       </w:r>
     </w:p>
@@ -8666,6 +8683,1216 @@
           <w:szCs w:val="22"/>
         </w:rPr>
         <w:t xml:space="preserve">Look at what you gathered and find two pieces of evidence that say a similar thing; be ready to explain the pattern.</w:t>
+      </w:r>
+    </w:p>
+    <w:p>
+      <w:pPr>
+        <w:pBdr>
+          <w:bottom w:val="single" w:color="B9B3A6" w:sz="6"/>
+        </w:pBdr>
+        <w:spacing w:after="120"/>
+      </w:pPr>
+    </w:p>
+    <w:p>
+      <w:pPr>
+        <w:pStyle w:val="Heading2"/>
+        <w:spacing w:after="80" w:before="200"/>
+      </w:pPr>
+      <w:r>
+        <w:rPr>
+          <w:b/>
+          <w:bCs/>
+          <w:color w:val="7A3B69"/>
+          <w:sz w:val="26"/>
+          <w:szCs w:val="26"/>
+        </w:rPr>
+        <w:t xml:space="preserve">Dig for the root cause</w:t>
+      </w:r>
+    </w:p>
+    <w:p>
+      <w:pPr>
+        <w:spacing w:after="100" w:before="0"/>
+      </w:pPr>
+      <w:r>
+        <w:rPr>
+          <w:b/>
+          <w:bCs/>
+          <w:color w:val="6E7A2E"/>
+          <w:sz w:val="20"/>
+          <w:szCs w:val="20"/>
+        </w:rPr>
+        <w:t xml:space="preserve">Activity   ·   1.5h facilitated   ·   0.5h independent</w:t>
+      </w:r>
+    </w:p>
+    <w:p>
+      <w:pPr>
+        <w:spacing w:after="120" w:before="0"/>
+      </w:pPr>
+      <w:r>
+        <w:rPr>
+          <w:sz w:val="22"/>
+          <w:szCs w:val="22"/>
+        </w:rPr>
+        <w:t xml:space="preserve">One way to analyse what we found: dig past the surface problem to its root cause, using the Five Whys (or a problem tree). Take a problem the evidence shows — the soil slides when it rains — and ask "why?" again and again, drawing the chain down until you reach a cause you cannot easily push past. Each "why" rests on our evidence, and it stays about the hills, never about blaming anyone. Getting to the root means our insights deal with the real cause, not just the symptom.</w:t>
+      </w:r>
+    </w:p>
+    <w:p>
+      <w:pPr>
+        <w:spacing w:after="40" w:before="80"/>
+      </w:pPr>
+      <w:r>
+        <w:rPr>
+          <w:b/>
+          <w:bCs/>
+          <w:i/>
+          <w:iCs/>
+          <w:color w:val="6E7A2E"/>
+          <w:sz w:val="21"/>
+          <w:szCs w:val="21"/>
+        </w:rPr>
+        <w:t xml:space="preserve">Activity in the material bank: Dig for the root cause</w:t>
+      </w:r>
+    </w:p>
+    <w:p>
+      <w:pPr>
+        <w:spacing w:after="120"/>
+      </w:pPr>
+      <w:r>
+        <w:rPr>
+          <w:b/>
+          <w:bCs/>
+          <w:color w:val="7A3B69"/>
+          <w:sz w:val="22"/>
+          <w:szCs w:val="22"/>
+        </w:rPr>
+        <w:t xml:space="preserve">Timing: </w:t>
+      </w:r>
+      <w:r>
+        <w:rPr>
+          <w:sz w:val="22"/>
+          <w:szCs w:val="22"/>
+        </w:rPr>
+        <w:t xml:space="preserve">1.5 hours facilitated + 0.5 hour independent</w:t>
+      </w:r>
+    </w:p>
+    <w:p>
+      <w:pPr>
+        <w:spacing w:after="120"/>
+      </w:pPr>
+      <w:r>
+        <w:rPr>
+          <w:b/>
+          <w:bCs/>
+          <w:color w:val="7A3B69"/>
+          <w:sz w:val="22"/>
+          <w:szCs w:val="22"/>
+        </w:rPr>
+        <w:t xml:space="preserve">Grouping: </w:t>
+      </w:r>
+      <w:r>
+        <w:rPr>
+          <w:sz w:val="22"/>
+          <w:szCs w:val="22"/>
+        </w:rPr>
+        <w:t xml:space="preserve">Whole group to model; pairs or small groups to dig</w:t>
+      </w:r>
+    </w:p>
+    <w:p>
+      <w:pPr>
+        <w:spacing w:after="40" w:before="80"/>
+      </w:pPr>
+      <w:r>
+        <w:rPr>
+          <w:b/>
+          <w:bCs/>
+          <w:i/>
+          <w:iCs/>
+          <w:color w:val="6E7A2E"/>
+          <w:sz w:val="21"/>
+          <w:szCs w:val="21"/>
+        </w:rPr>
+        <w:t xml:space="preserve">What learners do</w:t>
+      </w:r>
+    </w:p>
+    <w:p>
+      <w:pPr>
+        <w:pStyle w:val="ListParagraph"/>
+        <w:numPr>
+          <w:ilvl w:val="0"/>
+          <w:numId w:val="1"/>
+        </w:numPr>
+        <w:spacing w:after="60"/>
+      </w:pPr>
+      <w:r>
+        <w:rPr>
+          <w:sz w:val="22"/>
+          <w:szCs w:val="22"/>
+        </w:rPr>
+        <w:t xml:space="preserve">Take one problem our evidence shows, and ask "why does this happen?" — then ask "why?" of the answer, again and again.</w:t>
+      </w:r>
+    </w:p>
+    <w:p>
+      <w:pPr>
+        <w:pStyle w:val="ListParagraph"/>
+        <w:numPr>
+          <w:ilvl w:val="0"/>
+          <w:numId w:val="1"/>
+        </w:numPr>
+        <w:spacing w:after="60"/>
+      </w:pPr>
+      <w:r>
+        <w:rPr>
+          <w:sz w:val="22"/>
+          <w:szCs w:val="22"/>
+        </w:rPr>
+        <w:t xml:space="preserve">Draw the chain of whys going downward, until we reach a cause underneath that we cannot easily push past — the root cause.</w:t>
+      </w:r>
+    </w:p>
+    <w:p>
+      <w:pPr>
+        <w:pStyle w:val="ListParagraph"/>
+        <w:numPr>
+          <w:ilvl w:val="0"/>
+          <w:numId w:val="1"/>
+        </w:numPr>
+        <w:spacing w:after="60"/>
+      </w:pPr>
+      <w:r>
+        <w:rPr>
+          <w:sz w:val="22"/>
+          <w:szCs w:val="22"/>
+        </w:rPr>
+        <w:t xml:space="preserve">Check the root cause against our evidence, and notice that one problem can have more than one root.</w:t>
+      </w:r>
+    </w:p>
+    <w:p>
+      <w:pPr>
+        <w:spacing w:after="40" w:before="80"/>
+      </w:pPr>
+      <w:r>
+        <w:rPr>
+          <w:b/>
+          <w:bCs/>
+          <w:i/>
+          <w:iCs/>
+          <w:color w:val="6E7A2E"/>
+          <w:sz w:val="21"/>
+          <w:szCs w:val="21"/>
+        </w:rPr>
+        <w:t xml:space="preserve">Materials and preparation</w:t>
+      </w:r>
+    </w:p>
+    <w:p>
+      <w:pPr>
+        <w:pStyle w:val="ListParagraph"/>
+        <w:numPr>
+          <w:ilvl w:val="0"/>
+          <w:numId w:val="1"/>
+        </w:numPr>
+        <w:spacing w:after="60"/>
+      </w:pPr>
+      <w:r>
+        <w:rPr>
+          <w:sz w:val="22"/>
+          <w:szCs w:val="22"/>
+        </w:rPr>
+        <w:t xml:space="preserve">The themes and patterns from "Sort and theme what we found" — the problems our evidence surfaced.</w:t>
+      </w:r>
+    </w:p>
+    <w:p>
+      <w:pPr>
+        <w:pStyle w:val="ListParagraph"/>
+        <w:numPr>
+          <w:ilvl w:val="0"/>
+          <w:numId w:val="1"/>
+        </w:numPr>
+        <w:spacing w:after="60"/>
+      </w:pPr>
+      <w:r>
+        <w:rPr>
+          <w:sz w:val="22"/>
+          <w:szCs w:val="22"/>
+        </w:rPr>
+        <w:t xml:space="preserve">Wall or floor space to draw a chain of "whys" going down (or a tree with its roots).</w:t>
+      </w:r>
+    </w:p>
+    <w:p>
+      <w:pPr>
+        <w:pStyle w:val="ListParagraph"/>
+        <w:numPr>
+          <w:ilvl w:val="0"/>
+          <w:numId w:val="1"/>
+        </w:numPr>
+        <w:spacing w:after="60"/>
+      </w:pPr>
+      <w:r>
+        <w:rPr>
+          <w:sz w:val="22"/>
+          <w:szCs w:val="22"/>
+        </w:rPr>
+        <w:t xml:space="preserve">The community map and evidence log nearby, to check each "why" against what we found.</w:t>
+      </w:r>
+    </w:p>
+    <w:p>
+      <w:pPr>
+        <w:spacing w:after="40" w:before="80"/>
+      </w:pPr>
+      <w:r>
+        <w:rPr>
+          <w:b/>
+          <w:bCs/>
+          <w:i/>
+          <w:iCs/>
+          <w:color w:val="6E7A2E"/>
+          <w:sz w:val="21"/>
+          <w:szCs w:val="21"/>
+        </w:rPr>
+        <w:t xml:space="preserve">Facilitation notes</w:t>
+      </w:r>
+    </w:p>
+    <w:p>
+      <w:pPr>
+        <w:spacing w:after="120" w:before="0"/>
+      </w:pPr>
+      <w:r>
+        <w:rPr>
+          <w:sz w:val="22"/>
+          <w:szCs w:val="22"/>
+        </w:rPr>
+        <w:t xml:space="preserve">The one thing to get right: keep asking "why?" past the first easy answer. Learners (and all of us) tend to stop at the surface — "the hills slide because it rains." Model going deeper, gently: why are the hills bare, why were the trees cut, why was there no other choice. Each "why" should rest on our evidence, not on blame or guessing — this is analysis, not fault-finding, so keep it warm and about the hills, never about any person. Five is a guide, not a rule: stop when you reach a cause you cannot easily push past. A problem tree (roots = causes, trunk = the problem, branches = what it leads to) is another good way to draw the same thinking if your group prefers it.</w:t>
+      </w:r>
+    </w:p>
+    <w:p>
+      <w:pPr>
+        <w:pStyle w:val="Heading3"/>
+        <w:spacing w:after="60" w:before="160"/>
+      </w:pPr>
+      <w:r>
+        <w:rPr>
+          <w:b/>
+          <w:bCs/>
+          <w:color w:val="1F3A5F"/>
+          <w:sz w:val="23"/>
+          <w:szCs w:val="23"/>
+        </w:rPr>
+        <w:t xml:space="preserve">Step 1: Pick a problem, and ask the first why  (20 min)</w:t>
+      </w:r>
+    </w:p>
+    <w:p>
+      <w:pPr>
+        <w:spacing w:after="120" w:before="0"/>
+      </w:pPr>
+      <w:r>
+        <w:rPr>
+          <w:sz w:val="22"/>
+          <w:szCs w:val="22"/>
+        </w:rPr>
+        <w:t xml:space="preserve">From our themes, choose one clear problem the evidence shows — for example, "the soil slides down our hills when it rains." Write or draw it at the top. Ask the group: why does this happen? Draw the answer below it, joined by an arrow.</w:t>
+      </w:r>
+    </w:p>
+    <w:p>
+      <w:pPr>
+        <w:spacing w:after="40" w:before="80"/>
+      </w:pPr>
+      <w:r>
+        <w:rPr>
+          <w:b/>
+          <w:bCs/>
+          <w:i/>
+          <w:iCs/>
+          <w:color w:val="6E7A2E"/>
+          <w:sz w:val="21"/>
+          <w:szCs w:val="21"/>
+        </w:rPr>
+        <w:t xml:space="preserve">Ask</w:t>
+      </w:r>
+    </w:p>
+    <w:p>
+      <w:pPr>
+        <w:pStyle w:val="ListParagraph"/>
+        <w:numPr>
+          <w:ilvl w:val="0"/>
+          <w:numId w:val="1"/>
+        </w:numPr>
+        <w:spacing w:after="60"/>
+      </w:pPr>
+      <w:r>
+        <w:rPr>
+          <w:sz w:val="22"/>
+          <w:szCs w:val="22"/>
+        </w:rPr>
+        <w:t xml:space="preserve">What problem shall we dig into?</w:t>
+      </w:r>
+    </w:p>
+    <w:p>
+      <w:pPr>
+        <w:pStyle w:val="ListParagraph"/>
+        <w:numPr>
+          <w:ilvl w:val="0"/>
+          <w:numId w:val="1"/>
+        </w:numPr>
+        <w:spacing w:after="60"/>
+      </w:pPr>
+      <w:r>
+        <w:rPr>
+          <w:sz w:val="22"/>
+          <w:szCs w:val="22"/>
+        </w:rPr>
+        <w:t xml:space="preserve">Why does this happen?</w:t>
+      </w:r>
+    </w:p>
+    <w:p>
+      <w:pPr>
+        <w:pStyle w:val="Heading3"/>
+        <w:spacing w:after="60" w:before="160"/>
+      </w:pPr>
+      <w:r>
+        <w:rPr>
+          <w:b/>
+          <w:bCs/>
+          <w:color w:val="1F3A5F"/>
+          <w:sz w:val="23"/>
+          <w:szCs w:val="23"/>
+        </w:rPr>
+        <w:t xml:space="preserve">Step 2: Keep asking why, going down  (40 min)</w:t>
+      </w:r>
+    </w:p>
+    <w:p>
+      <w:pPr>
+        <w:spacing w:after="120" w:before="0"/>
+      </w:pPr>
+      <w:r>
+        <w:rPr>
+          <w:sz w:val="22"/>
+          <w:szCs w:val="22"/>
+        </w:rPr>
+        <w:t xml:space="preserve">Ask "why?" of each answer in turn, drawing the chain downward — about five times, until you reach a cause you cannot easily push past. For example: the soil slides → because the hills are bare → because the trees were cut → because families needed wood to cook and build → because there was no other fuel and many people arrived very fast. Let learners lead once you have modelled it, in pairs or small groups, each digging one problem.</w:t>
+      </w:r>
+    </w:p>
+    <w:p>
+      <w:pPr>
+        <w:spacing w:after="40" w:before="80"/>
+      </w:pPr>
+      <w:r>
+        <w:rPr>
+          <w:b/>
+          <w:bCs/>
+          <w:i/>
+          <w:iCs/>
+          <w:color w:val="6E7A2E"/>
+          <w:sz w:val="21"/>
+          <w:szCs w:val="21"/>
+        </w:rPr>
+        <w:t xml:space="preserve">Ask</w:t>
+      </w:r>
+    </w:p>
+    <w:p>
+      <w:pPr>
+        <w:pStyle w:val="ListParagraph"/>
+        <w:numPr>
+          <w:ilvl w:val="0"/>
+          <w:numId w:val="1"/>
+        </w:numPr>
+        <w:spacing w:after="60"/>
+      </w:pPr>
+      <w:r>
+        <w:rPr>
+          <w:sz w:val="22"/>
+          <w:szCs w:val="22"/>
+        </w:rPr>
+        <w:t xml:space="preserve">And why is that?</w:t>
+      </w:r>
+    </w:p>
+    <w:p>
+      <w:pPr>
+        <w:pStyle w:val="ListParagraph"/>
+        <w:numPr>
+          <w:ilvl w:val="0"/>
+          <w:numId w:val="1"/>
+        </w:numPr>
+        <w:spacing w:after="60"/>
+      </w:pPr>
+      <w:r>
+        <w:rPr>
+          <w:sz w:val="22"/>
+          <w:szCs w:val="22"/>
+        </w:rPr>
+        <w:t xml:space="preserve">Is that the real cause, or is there something underneath it?</w:t>
+      </w:r>
+    </w:p>
+    <w:p>
+      <w:pPr>
+        <w:pStyle w:val="Heading3"/>
+        <w:spacing w:after="60" w:before="160"/>
+      </w:pPr>
+      <w:r>
+        <w:rPr>
+          <w:b/>
+          <w:bCs/>
+          <w:color w:val="1F3A5F"/>
+          <w:sz w:val="23"/>
+          <w:szCs w:val="23"/>
+        </w:rPr>
+        <w:t xml:space="preserve">Step 3: Find the root, and check it  (30 min)</w:t>
+      </w:r>
+    </w:p>
+    <w:p>
+      <w:pPr>
+        <w:spacing w:after="120" w:before="0"/>
+      </w:pPr>
+      <w:r>
+        <w:rPr>
+          <w:sz w:val="22"/>
+          <w:szCs w:val="22"/>
+        </w:rPr>
+        <w:t xml:space="preserve">Name the root cause (or causes — there is often more than one) at the bottom of the chain. Check it against our evidence: do our sources and what people told us support it? Keep it hopeful — knowing the root cause is what lets us think clearly about what could help.</w:t>
+      </w:r>
+    </w:p>
+    <w:p>
+      <w:pPr>
+        <w:spacing w:after="40" w:before="80"/>
+      </w:pPr>
+      <w:r>
+        <w:rPr>
+          <w:b/>
+          <w:bCs/>
+          <w:i/>
+          <w:iCs/>
+          <w:color w:val="6E7A2E"/>
+          <w:sz w:val="21"/>
+          <w:szCs w:val="21"/>
+        </w:rPr>
+        <w:t xml:space="preserve">Ask</w:t>
+      </w:r>
+    </w:p>
+    <w:p>
+      <w:pPr>
+        <w:pStyle w:val="ListParagraph"/>
+        <w:numPr>
+          <w:ilvl w:val="0"/>
+          <w:numId w:val="1"/>
+        </w:numPr>
+        <w:spacing w:after="60"/>
+      </w:pPr>
+      <w:r>
+        <w:rPr>
+          <w:sz w:val="22"/>
+          <w:szCs w:val="22"/>
+        </w:rPr>
+        <w:t xml:space="preserve">What is the cause underneath all the others?</w:t>
+      </w:r>
+    </w:p>
+    <w:p>
+      <w:pPr>
+        <w:pStyle w:val="ListParagraph"/>
+        <w:numPr>
+          <w:ilvl w:val="0"/>
+          <w:numId w:val="1"/>
+        </w:numPr>
+        <w:spacing w:after="60"/>
+      </w:pPr>
+      <w:r>
+        <w:rPr>
+          <w:sz w:val="22"/>
+          <w:szCs w:val="22"/>
+        </w:rPr>
+        <w:t xml:space="preserve">Does our evidence support this root cause?</w:t>
+      </w:r>
+    </w:p>
+    <w:p>
+      <w:pPr>
+        <w:spacing w:after="120"/>
+      </w:pPr>
+      <w:r>
+        <w:rPr>
+          <w:b/>
+          <w:bCs/>
+          <w:color w:val="7A3B69"/>
+          <w:sz w:val="22"/>
+          <w:szCs w:val="22"/>
+        </w:rPr>
+        <w:t xml:space="preserve">Student worksheet: </w:t>
+      </w:r>
+      <w:r>
+        <w:rPr>
+          <w:sz w:val="22"/>
+          <w:szCs w:val="22"/>
+        </w:rPr>
+        <w:t xml:space="preserve">Dig for the root cause (in the student workbook)</w:t>
+      </w:r>
+    </w:p>
+    <w:p>
+      <w:pPr>
+        <w:spacing w:after="120"/>
+      </w:pPr>
+      <w:r>
+        <w:rPr>
+          <w:b/>
+          <w:bCs/>
+          <w:color w:val="7A3B69"/>
+          <w:sz w:val="22"/>
+          <w:szCs w:val="22"/>
+        </w:rPr>
+        <w:t xml:space="preserve">Independent task: </w:t>
+      </w:r>
+      <w:r>
+        <w:rPr>
+          <w:sz w:val="22"/>
+          <w:szCs w:val="22"/>
+        </w:rPr>
+        <w:t xml:space="preserve">Take one problem about our hills and ask 'why?' three times, to see what is underneath it.</w:t>
+      </w:r>
+    </w:p>
+    <w:p>
+      <w:pPr>
+        <w:pBdr>
+          <w:bottom w:val="single" w:color="B9B3A6" w:sz="6"/>
+        </w:pBdr>
+        <w:spacing w:after="120"/>
+      </w:pPr>
+    </w:p>
+    <w:p>
+      <w:pPr>
+        <w:pStyle w:val="Heading2"/>
+        <w:spacing w:after="80" w:before="200"/>
+      </w:pPr>
+      <w:r>
+        <w:rPr>
+          <w:b/>
+          <w:bCs/>
+          <w:color w:val="7A3B69"/>
+          <w:sz w:val="26"/>
+          <w:szCs w:val="26"/>
+        </w:rPr>
+        <w:t xml:space="preserve">Who, what, and why — looking deeper</w:t>
+      </w:r>
+    </w:p>
+    <w:p>
+      <w:pPr>
+        <w:spacing w:after="100" w:before="0"/>
+      </w:pPr>
+      <w:r>
+        <w:rPr>
+          <w:b/>
+          <w:bCs/>
+          <w:color w:val="6E7A2E"/>
+          <w:sz w:val="20"/>
+          <w:szCs w:val="20"/>
+        </w:rPr>
+        <w:t xml:space="preserve">Activity   ·   1.5h facilitated   ·   0.5h independent</w:t>
+      </w:r>
+    </w:p>
+    <w:p>
+      <w:pPr>
+        <w:spacing w:after="120" w:before="0"/>
+      </w:pPr>
+      <w:r>
+        <w:rPr>
+          <w:sz w:val="22"/>
+          <w:szCs w:val="22"/>
+        </w:rPr>
+        <w:t xml:space="preserve">A second way to analyse: see the problem as a human system, through three questions — who or what has the power to make it worse or better (families, agencies, the government, the monsoon, the hills); what beliefs and attitudes shape it ("the trees are not ours to plant" versus "we can care for our hills"); and who or what is helped or hurt by it. Build the three up on the wall. This makes insights deeper and fairer — and it stays about understanding, never blaming.</w:t>
+      </w:r>
+    </w:p>
+    <w:p>
+      <w:pPr>
+        <w:spacing w:after="40" w:before="80"/>
+      </w:pPr>
+      <w:r>
+        <w:rPr>
+          <w:b/>
+          <w:bCs/>
+          <w:i/>
+          <w:iCs/>
+          <w:color w:val="6E7A2E"/>
+          <w:sz w:val="21"/>
+          <w:szCs w:val="21"/>
+        </w:rPr>
+        <w:t xml:space="preserve">Activity in the material bank: Who, what, and why — looking deeper</w:t>
+      </w:r>
+    </w:p>
+    <w:p>
+      <w:pPr>
+        <w:spacing w:after="120"/>
+      </w:pPr>
+      <w:r>
+        <w:rPr>
+          <w:b/>
+          <w:bCs/>
+          <w:color w:val="7A3B69"/>
+          <w:sz w:val="22"/>
+          <w:szCs w:val="22"/>
+        </w:rPr>
+        <w:t xml:space="preserve">Timing: </w:t>
+      </w:r>
+      <w:r>
+        <w:rPr>
+          <w:sz w:val="22"/>
+          <w:szCs w:val="22"/>
+        </w:rPr>
+        <w:t xml:space="preserve">1.5 hours facilitated + 0.5 hour independent</w:t>
+      </w:r>
+    </w:p>
+    <w:p>
+      <w:pPr>
+        <w:spacing w:after="120"/>
+      </w:pPr>
+      <w:r>
+        <w:rPr>
+          <w:b/>
+          <w:bCs/>
+          <w:color w:val="7A3B69"/>
+          <w:sz w:val="22"/>
+          <w:szCs w:val="22"/>
+        </w:rPr>
+        <w:t xml:space="preserve">Grouping: </w:t>
+      </w:r>
+      <w:r>
+        <w:rPr>
+          <w:sz w:val="22"/>
+          <w:szCs w:val="22"/>
+        </w:rPr>
+        <w:t xml:space="preserve">Whole group, with three areas on the wall or floor; pairs feed each one</w:t>
+      </w:r>
+    </w:p>
+    <w:p>
+      <w:pPr>
+        <w:spacing w:after="40" w:before="80"/>
+      </w:pPr>
+      <w:r>
+        <w:rPr>
+          <w:b/>
+          <w:bCs/>
+          <w:i/>
+          <w:iCs/>
+          <w:color w:val="6E7A2E"/>
+          <w:sz w:val="21"/>
+          <w:szCs w:val="21"/>
+        </w:rPr>
+        <w:t xml:space="preserve">What learners do</w:t>
+      </w:r>
+    </w:p>
+    <w:p>
+      <w:pPr>
+        <w:pStyle w:val="ListParagraph"/>
+        <w:numPr>
+          <w:ilvl w:val="0"/>
+          <w:numId w:val="1"/>
+        </w:numPr>
+        <w:spacing w:after="60"/>
+      </w:pPr>
+      <w:r>
+        <w:rPr>
+          <w:sz w:val="22"/>
+          <w:szCs w:val="22"/>
+        </w:rPr>
+        <w:t xml:space="preserve">Ask who or what has the power to make the problem worse or better — families, agencies, the government, and things like the monsoon and the hills themselves.</w:t>
+      </w:r>
+    </w:p>
+    <w:p>
+      <w:pPr>
+        <w:pStyle w:val="ListParagraph"/>
+        <w:numPr>
+          <w:ilvl w:val="0"/>
+          <w:numId w:val="1"/>
+        </w:numPr>
+        <w:spacing w:after="60"/>
+      </w:pPr>
+      <w:r>
+        <w:rPr>
+          <w:sz w:val="22"/>
+          <w:szCs w:val="22"/>
+        </w:rPr>
+        <w:t xml:space="preserve">Ask what people believe or feel that causes the problem, or that could help solve it.</w:t>
+      </w:r>
+    </w:p>
+    <w:p>
+      <w:pPr>
+        <w:pStyle w:val="ListParagraph"/>
+        <w:numPr>
+          <w:ilvl w:val="0"/>
+          <w:numId w:val="1"/>
+        </w:numPr>
+        <w:spacing w:after="60"/>
+      </w:pPr>
+      <w:r>
+        <w:rPr>
+          <w:sz w:val="22"/>
+          <w:szCs w:val="22"/>
+        </w:rPr>
+        <w:t xml:space="preserve">Ask who or what is helped, and who or what is hurt, by the problem and by what is being done about it.</w:t>
+      </w:r>
+    </w:p>
+    <w:p>
+      <w:pPr>
+        <w:pStyle w:val="ListParagraph"/>
+        <w:numPr>
+          <w:ilvl w:val="0"/>
+          <w:numId w:val="1"/>
+        </w:numPr>
+        <w:spacing w:after="60"/>
+      </w:pPr>
+      <w:r>
+        <w:rPr>
+          <w:sz w:val="22"/>
+          <w:szCs w:val="22"/>
+        </w:rPr>
+        <w:t xml:space="preserve">Stand back and notice what these three lenses show that the evidence alone did not.</w:t>
+      </w:r>
+    </w:p>
+    <w:p>
+      <w:pPr>
+        <w:spacing w:after="40" w:before="80"/>
+      </w:pPr>
+      <w:r>
+        <w:rPr>
+          <w:b/>
+          <w:bCs/>
+          <w:i/>
+          <w:iCs/>
+          <w:color w:val="6E7A2E"/>
+          <w:sz w:val="21"/>
+          <w:szCs w:val="21"/>
+        </w:rPr>
+        <w:t xml:space="preserve">Materials and preparation</w:t>
+      </w:r>
+    </w:p>
+    <w:p>
+      <w:pPr>
+        <w:pStyle w:val="ListParagraph"/>
+        <w:numPr>
+          <w:ilvl w:val="0"/>
+          <w:numId w:val="1"/>
+        </w:numPr>
+        <w:spacing w:after="60"/>
+      </w:pPr>
+      <w:r>
+        <w:rPr>
+          <w:sz w:val="22"/>
+          <w:szCs w:val="22"/>
+        </w:rPr>
+        <w:t xml:space="preserve">Three areas marked on the wall or floor — one for each question — where cards and drawings can be placed.</w:t>
+      </w:r>
+    </w:p>
+    <w:p>
+      <w:pPr>
+        <w:pStyle w:val="ListParagraph"/>
+        <w:numPr>
+          <w:ilvl w:val="0"/>
+          <w:numId w:val="1"/>
+        </w:numPr>
+        <w:spacing w:after="60"/>
+      </w:pPr>
+      <w:r>
+        <w:rPr>
+          <w:sz w:val="22"/>
+          <w:szCs w:val="22"/>
+        </w:rPr>
+        <w:t xml:space="preserve">The themes and evidence from the earlier analysis, and the community map, nearby.</w:t>
+      </w:r>
+    </w:p>
+    <w:p>
+      <w:pPr>
+        <w:pStyle w:val="ListParagraph"/>
+        <w:numPr>
+          <w:ilvl w:val="0"/>
+          <w:numId w:val="1"/>
+        </w:numPr>
+        <w:spacing w:after="60"/>
+      </w:pPr>
+      <w:r>
+        <w:rPr>
+          <w:sz w:val="22"/>
+          <w:szCs w:val="22"/>
+        </w:rPr>
+        <w:t xml:space="preserve">Cards or scraps of paper to write or draw on and move around.</w:t>
+      </w:r>
+    </w:p>
+    <w:p>
+      <w:pPr>
+        <w:spacing w:after="40" w:before="80"/>
+      </w:pPr>
+      <w:r>
+        <w:rPr>
+          <w:b/>
+          <w:bCs/>
+          <w:i/>
+          <w:iCs/>
+          <w:color w:val="6E7A2E"/>
+          <w:sz w:val="21"/>
+          <w:szCs w:val="21"/>
+        </w:rPr>
+        <w:t xml:space="preserve">Facilitation notes</w:t>
+      </w:r>
+    </w:p>
+    <w:p>
+      <w:pPr>
+        <w:spacing w:after="120" w:before="0"/>
+      </w:pPr>
+      <w:r>
+        <w:rPr>
+          <w:sz w:val="22"/>
+          <w:szCs w:val="22"/>
+        </w:rPr>
+        <w:t xml:space="preserve">The one thing to get right: keep it about understanding, not blaming. The point is to see the problem as a system that people are part of — where power sits, what beliefs shape it, and who wins and loses — because that is what makes an insight deep and fair rather than a simple "trees good, cutting bad". Take the three questions one at a time, each as a short round, building up cards in its area. Handle beliefs with special care: name attitudes gently and generally ("some people feel the trees are not theirs to plant"), never pointing at anyone. Draw out that people who did harm often had little choice, and that the same people can be part of the solution.</w:t>
+      </w:r>
+    </w:p>
+    <w:p>
+      <w:pPr>
+        <w:pStyle w:val="Heading3"/>
+        <w:spacing w:after="60" w:before="160"/>
+      </w:pPr>
+      <w:r>
+        <w:rPr>
+          <w:b/>
+          <w:bCs/>
+          <w:color w:val="1F3A5F"/>
+          <w:sz w:val="23"/>
+          <w:szCs w:val="23"/>
+        </w:rPr>
+        <w:t xml:space="preserve">Step 1: Who or what has power here?  (30 min)</w:t>
+      </w:r>
+    </w:p>
+    <w:p>
+      <w:pPr>
+        <w:spacing w:after="120" w:before="0"/>
+      </w:pPr>
+      <w:r>
+        <w:rPr>
+          <w:sz w:val="22"/>
+          <w:szCs w:val="22"/>
+        </w:rPr>
+        <w:t xml:space="preserve">In the first area, gather who or what can make the problem worse or better: families who cook and build, the agencies planting and giving gas, the government and the camp leaders, and forces like the heavy monsoon and the steep hills themselves. Some have a lot of power, some a little. This shows who could act, and who a solution depends on.</w:t>
+      </w:r>
+    </w:p>
+    <w:p>
+      <w:pPr>
+        <w:spacing w:after="40" w:before="80"/>
+      </w:pPr>
+      <w:r>
+        <w:rPr>
+          <w:b/>
+          <w:bCs/>
+          <w:i/>
+          <w:iCs/>
+          <w:color w:val="6E7A2E"/>
+          <w:sz w:val="21"/>
+          <w:szCs w:val="21"/>
+        </w:rPr>
+        <w:t xml:space="preserve">Ask</w:t>
+      </w:r>
+    </w:p>
+    <w:p>
+      <w:pPr>
+        <w:pStyle w:val="ListParagraph"/>
+        <w:numPr>
+          <w:ilvl w:val="0"/>
+          <w:numId w:val="1"/>
+        </w:numPr>
+        <w:spacing w:after="60"/>
+      </w:pPr>
+      <w:r>
+        <w:rPr>
+          <w:sz w:val="22"/>
+          <w:szCs w:val="22"/>
+        </w:rPr>
+        <w:t xml:space="preserve">Who can change this — even a little?</w:t>
+      </w:r>
+    </w:p>
+    <w:p>
+      <w:pPr>
+        <w:pStyle w:val="ListParagraph"/>
+        <w:numPr>
+          <w:ilvl w:val="0"/>
+          <w:numId w:val="1"/>
+        </w:numPr>
+        <w:spacing w:after="60"/>
+      </w:pPr>
+      <w:r>
+        <w:rPr>
+          <w:sz w:val="22"/>
+          <w:szCs w:val="22"/>
+        </w:rPr>
+        <w:t xml:space="preserve">What has power here that is not a person (the rain, the hills)?</w:t>
+      </w:r>
+    </w:p>
+    <w:p>
+      <w:pPr>
+        <w:pStyle w:val="Heading3"/>
+        <w:spacing w:after="60" w:before="160"/>
+      </w:pPr>
+      <w:r>
+        <w:rPr>
+          <w:b/>
+          <w:bCs/>
+          <w:color w:val="1F3A5F"/>
+          <w:sz w:val="23"/>
+          <w:szCs w:val="23"/>
+        </w:rPr>
+        <w:t xml:space="preserve">Step 2: What do people believe or feel?  (30 min)</w:t>
+      </w:r>
+    </w:p>
+    <w:p>
+      <w:pPr>
+        <w:spacing w:after="120" w:before="0"/>
+      </w:pPr>
+      <w:r>
+        <w:rPr>
+          <w:sz w:val="22"/>
+          <w:szCs w:val="22"/>
+        </w:rPr>
+        <w:t xml:space="preserve">In the second area, name the beliefs and attitudes that make the problem worse or could make it better — gently and generally. For example: "we had no other choice but to cut wood"; "the trees are not ours to plant"; "looking after the hills is the agencies' job"; and, on the other side, "we can care for our own hills". Beliefs shape what people do, so they matter.</w:t>
+      </w:r>
+    </w:p>
+    <w:p>
+      <w:pPr>
+        <w:spacing w:after="40" w:before="80"/>
+      </w:pPr>
+      <w:r>
+        <w:rPr>
+          <w:b/>
+          <w:bCs/>
+          <w:i/>
+          <w:iCs/>
+          <w:color w:val="6E7A2E"/>
+          <w:sz w:val="21"/>
+          <w:szCs w:val="21"/>
+        </w:rPr>
+        <w:t xml:space="preserve">Ask</w:t>
+      </w:r>
+    </w:p>
+    <w:p>
+      <w:pPr>
+        <w:pStyle w:val="ListParagraph"/>
+        <w:numPr>
+          <w:ilvl w:val="0"/>
+          <w:numId w:val="1"/>
+        </w:numPr>
+        <w:spacing w:after="60"/>
+      </w:pPr>
+      <w:r>
+        <w:rPr>
+          <w:sz w:val="22"/>
+          <w:szCs w:val="22"/>
+        </w:rPr>
+        <w:t xml:space="preserve">What do people believe that makes the problem harder to solve?</w:t>
+      </w:r>
+    </w:p>
+    <w:p>
+      <w:pPr>
+        <w:pStyle w:val="ListParagraph"/>
+        <w:numPr>
+          <w:ilvl w:val="0"/>
+          <w:numId w:val="1"/>
+        </w:numPr>
+        <w:spacing w:after="60"/>
+      </w:pPr>
+      <w:r>
+        <w:rPr>
+          <w:sz w:val="22"/>
+          <w:szCs w:val="22"/>
+        </w:rPr>
+        <w:t xml:space="preserve">What belief could help solve it?</w:t>
+      </w:r>
+    </w:p>
+    <w:p>
+      <w:pPr>
+        <w:pStyle w:val="Heading3"/>
+        <w:spacing w:after="60" w:before="160"/>
+      </w:pPr>
+      <w:r>
+        <w:rPr>
+          <w:b/>
+          <w:bCs/>
+          <w:color w:val="1F3A5F"/>
+          <w:sz w:val="23"/>
+          <w:szCs w:val="23"/>
+        </w:rPr>
+        <w:t xml:space="preserve">Step 3: Who is helped, and who is hurt?  (20 min)</w:t>
+      </w:r>
+    </w:p>
+    <w:p>
+      <w:pPr>
+        <w:spacing w:after="120" w:before="0"/>
+      </w:pPr>
+      <w:r>
+        <w:rPr>
+          <w:sz w:val="22"/>
+          <w:szCs w:val="22"/>
+        </w:rPr>
+        <w:t xml:space="preserve">In the third area, sort who or what is hurt by the problem — families on bare slopes, the women who used to collect firewood, the animals whose home was cleared — and who is helped when things improve. Notice who carries the most harm, and who a good solution should protect first.</w:t>
+      </w:r>
+    </w:p>
+    <w:p>
+      <w:pPr>
+        <w:spacing w:after="40" w:before="80"/>
+      </w:pPr>
+      <w:r>
+        <w:rPr>
+          <w:b/>
+          <w:bCs/>
+          <w:i/>
+          <w:iCs/>
+          <w:color w:val="6E7A2E"/>
+          <w:sz w:val="21"/>
+          <w:szCs w:val="21"/>
+        </w:rPr>
+        <w:t xml:space="preserve">Ask</w:t>
+      </w:r>
+    </w:p>
+    <w:p>
+      <w:pPr>
+        <w:pStyle w:val="ListParagraph"/>
+        <w:numPr>
+          <w:ilvl w:val="0"/>
+          <w:numId w:val="1"/>
+        </w:numPr>
+        <w:spacing w:after="60"/>
+      </w:pPr>
+      <w:r>
+        <w:rPr>
+          <w:sz w:val="22"/>
+          <w:szCs w:val="22"/>
+        </w:rPr>
+        <w:t xml:space="preserve">Who suffers most from this problem?</w:t>
+      </w:r>
+    </w:p>
+    <w:p>
+      <w:pPr>
+        <w:pStyle w:val="ListParagraph"/>
+        <w:numPr>
+          <w:ilvl w:val="0"/>
+          <w:numId w:val="1"/>
+        </w:numPr>
+        <w:spacing w:after="60"/>
+      </w:pPr>
+      <w:r>
+        <w:rPr>
+          <w:sz w:val="22"/>
+          <w:szCs w:val="22"/>
+        </w:rPr>
+        <w:t xml:space="preserve">Who is helped when the hills come back?</w:t>
+      </w:r>
+    </w:p>
+    <w:p>
+      <w:pPr>
+        <w:pStyle w:val="Heading3"/>
+        <w:spacing w:after="60" w:before="160"/>
+      </w:pPr>
+      <w:r>
+        <w:rPr>
+          <w:b/>
+          <w:bCs/>
+          <w:color w:val="1F3A5F"/>
+          <w:sz w:val="23"/>
+          <w:szCs w:val="23"/>
+        </w:rPr>
+        <w:t xml:space="preserve">Step 4: Stand back — what do we see now?  (10 min)</w:t>
+      </w:r>
+    </w:p>
+    <w:p>
+      <w:pPr>
+        <w:spacing w:after="120" w:before="0"/>
+      </w:pPr>
+      <w:r>
+        <w:rPr>
+          <w:sz w:val="22"/>
+          <w:szCs w:val="22"/>
+        </w:rPr>
+        <w:t xml:space="preserve">Look at all three areas together. What do power, beliefs, and who-wins-and-loses show us that the plain evidence did not? Draw one or two things the group notices — these feed our insights.</w:t>
+      </w:r>
+    </w:p>
+    <w:p>
+      <w:pPr>
+        <w:spacing w:after="40" w:before="80"/>
+      </w:pPr>
+      <w:r>
+        <w:rPr>
+          <w:b/>
+          <w:bCs/>
+          <w:i/>
+          <w:iCs/>
+          <w:color w:val="6E7A2E"/>
+          <w:sz w:val="21"/>
+          <w:szCs w:val="21"/>
+        </w:rPr>
+        <w:t xml:space="preserve">Ask</w:t>
+      </w:r>
+    </w:p>
+    <w:p>
+      <w:pPr>
+        <w:pStyle w:val="ListParagraph"/>
+        <w:numPr>
+          <w:ilvl w:val="0"/>
+          <w:numId w:val="1"/>
+        </w:numPr>
+        <w:spacing w:after="60"/>
+      </w:pPr>
+      <w:r>
+        <w:rPr>
+          <w:sz w:val="22"/>
+          <w:szCs w:val="22"/>
+        </w:rPr>
+        <w:t xml:space="preserve">What does looking deeper show that our evidence alone did not?</w:t>
+      </w:r>
+    </w:p>
+    <w:p>
+      <w:pPr>
+        <w:spacing w:after="120"/>
+      </w:pPr>
+      <w:r>
+        <w:rPr>
+          <w:b/>
+          <w:bCs/>
+          <w:color w:val="7A3B69"/>
+          <w:sz w:val="22"/>
+          <w:szCs w:val="22"/>
+        </w:rPr>
+        <w:t xml:space="preserve">Student worksheet: </w:t>
+      </w:r>
+      <w:r>
+        <w:rPr>
+          <w:sz w:val="22"/>
+          <w:szCs w:val="22"/>
+        </w:rPr>
+        <w:t xml:space="preserve">Looking deeper — power, beliefs, who is helped and hurt (in the student workbook)</w:t>
+      </w:r>
+    </w:p>
+    <w:p>
+      <w:pPr>
+        <w:spacing w:after="120"/>
+      </w:pPr>
+      <w:r>
+        <w:rPr>
+          <w:b/>
+          <w:bCs/>
+          <w:color w:val="7A3B69"/>
+          <w:sz w:val="22"/>
+          <w:szCs w:val="22"/>
+        </w:rPr>
+        <w:t xml:space="preserve">Independent task: </w:t>
+      </w:r>
+      <w:r>
+        <w:rPr>
+          <w:sz w:val="22"/>
+          <w:szCs w:val="22"/>
+        </w:rPr>
+        <w:t xml:space="preserve">Notice one person or group who is hurt by the bare hills, and one who could help make them green again.</w:t>
+      </w:r>
+    </w:p>
+    <w:p>
+      <w:pPr>
+        <w:spacing w:after="120" w:before="0"/>
+      </w:pPr>
+      <w:r>
+        <w:rPr>
+          <w:i/>
+          <w:iCs/>
+          <w:color w:val="5A6473"/>
+          <w:sz w:val="21"/>
+          <w:szCs w:val="21"/>
+        </w:rPr>
+        <w:t xml:space="preserve">Root cause and looking deeper are two ways to analyse the evidence — do one or both, depending on your cohort and the time you have. Both feed the next block, where findings become insights.</w:t>
       </w:r>
     </w:p>
     <w:p>

</xml_diff>